<commit_message>
Přidání aplikační části do dokumentace.
</commit_message>
<xml_diff>
--- a/docs/Hostingové centrum - dokumentace.docx
+++ b/docs/Hostingové centrum - dokumentace.docx
@@ -229,7 +229,7 @@
           <w:r>
             <w:fldChar w:fldCharType="separate"/>
           </w:r>
-          <w:hyperlink w:anchor="_Toc226914621" w:history="1">
+          <w:hyperlink w:anchor="_Toc227005783" w:history="1">
             <w:r>
               <w:rPr>
                 <w:rStyle w:val="Hypertextovodkaz"/>
@@ -256,7 +256,7 @@
                 <w:noProof/>
                 <w:webHidden/>
               </w:rPr>
-              <w:instrText xml:space="preserve"> PAGEREF _Toc226914621 \h </w:instrText>
+              <w:instrText xml:space="preserve"> PAGEREF _Toc227005783 \h </w:instrText>
             </w:r>
             <w:r>
               <w:rPr>
@@ -302,7 +302,7 @@
               <w14:ligatures w14:val="standardContextual"/>
             </w:rPr>
           </w:pPr>
-          <w:hyperlink w:anchor="_Toc226914622" w:history="1">
+          <w:hyperlink w:anchor="_Toc227005784" w:history="1">
             <w:r>
               <w:rPr>
                 <w:rStyle w:val="Hypertextovodkaz"/>
@@ -329,7 +329,7 @@
                 <w:noProof/>
                 <w:webHidden/>
               </w:rPr>
-              <w:instrText xml:space="preserve"> PAGEREF _Toc226914622 \h </w:instrText>
+              <w:instrText xml:space="preserve"> PAGEREF _Toc227005784 \h </w:instrText>
             </w:r>
             <w:r>
               <w:rPr>
@@ -375,7 +375,7 @@
               <w14:ligatures w14:val="standardContextual"/>
             </w:rPr>
           </w:pPr>
-          <w:hyperlink w:anchor="_Toc226914623" w:history="1">
+          <w:hyperlink w:anchor="_Toc227005785" w:history="1">
             <w:r>
               <w:rPr>
                 <w:rStyle w:val="Hypertextovodkaz"/>
@@ -402,7 +402,7 @@
                 <w:noProof/>
                 <w:webHidden/>
               </w:rPr>
-              <w:instrText xml:space="preserve"> PAGEREF _Toc226914623 \h </w:instrText>
+              <w:instrText xml:space="preserve"> PAGEREF _Toc227005785 \h </w:instrText>
             </w:r>
             <w:r>
               <w:rPr>
@@ -448,7 +448,7 @@
               <w14:ligatures w14:val="standardContextual"/>
             </w:rPr>
           </w:pPr>
-          <w:hyperlink w:anchor="_Toc226914624" w:history="1">
+          <w:hyperlink w:anchor="_Toc227005786" w:history="1">
             <w:r>
               <w:rPr>
                 <w:rStyle w:val="Hypertextovodkaz"/>
@@ -475,7 +475,7 @@
                 <w:noProof/>
                 <w:webHidden/>
               </w:rPr>
-              <w:instrText xml:space="preserve"> PAGEREF _Toc226914624 \h </w:instrText>
+              <w:instrText xml:space="preserve"> PAGEREF _Toc227005786 \h </w:instrText>
             </w:r>
             <w:r>
               <w:rPr>
@@ -521,7 +521,7 @@
               <w14:ligatures w14:val="standardContextual"/>
             </w:rPr>
           </w:pPr>
-          <w:hyperlink w:anchor="_Toc226914625" w:history="1">
+          <w:hyperlink w:anchor="_Toc227005787" w:history="1">
             <w:r>
               <w:rPr>
                 <w:rStyle w:val="Hypertextovodkaz"/>
@@ -548,7 +548,7 @@
                 <w:noProof/>
                 <w:webHidden/>
               </w:rPr>
-              <w:instrText xml:space="preserve"> PAGEREF _Toc226914625 \h </w:instrText>
+              <w:instrText xml:space="preserve"> PAGEREF _Toc227005787 \h </w:instrText>
             </w:r>
             <w:r>
               <w:rPr>
@@ -594,7 +594,7 @@
               <w14:ligatures w14:val="standardContextual"/>
             </w:rPr>
           </w:pPr>
-          <w:hyperlink w:anchor="_Toc226914626" w:history="1">
+          <w:hyperlink w:anchor="_Toc227005788" w:history="1">
             <w:r>
               <w:rPr>
                 <w:rStyle w:val="Hypertextovodkaz"/>
@@ -621,7 +621,7 @@
                 <w:noProof/>
                 <w:webHidden/>
               </w:rPr>
-              <w:instrText xml:space="preserve"> PAGEREF _Toc226914626 \h </w:instrText>
+              <w:instrText xml:space="preserve"> PAGEREF _Toc227005788 \h </w:instrText>
             </w:r>
             <w:r>
               <w:rPr>
@@ -667,7 +667,7 @@
               <w14:ligatures w14:val="standardContextual"/>
             </w:rPr>
           </w:pPr>
-          <w:hyperlink w:anchor="_Toc226914627" w:history="1">
+          <w:hyperlink w:anchor="_Toc227005789" w:history="1">
             <w:r>
               <w:rPr>
                 <w:rStyle w:val="Hypertextovodkaz"/>
@@ -694,7 +694,7 @@
                 <w:noProof/>
                 <w:webHidden/>
               </w:rPr>
-              <w:instrText xml:space="preserve"> PAGEREF _Toc226914627 \h </w:instrText>
+              <w:instrText xml:space="preserve"> PAGEREF _Toc227005789 \h </w:instrText>
             </w:r>
             <w:r>
               <w:rPr>
@@ -740,7 +740,7 @@
               <w14:ligatures w14:val="standardContextual"/>
             </w:rPr>
           </w:pPr>
-          <w:hyperlink w:anchor="_Toc226914628" w:history="1">
+          <w:hyperlink w:anchor="_Toc227005790" w:history="1">
             <w:r>
               <w:rPr>
                 <w:rStyle w:val="Hypertextovodkaz"/>
@@ -767,7 +767,7 @@
                 <w:noProof/>
                 <w:webHidden/>
               </w:rPr>
-              <w:instrText xml:space="preserve"> PAGEREF _Toc226914628 \h </w:instrText>
+              <w:instrText xml:space="preserve"> PAGEREF _Toc227005790 \h </w:instrText>
             </w:r>
             <w:r>
               <w:rPr>
@@ -813,7 +813,7 @@
               <w14:ligatures w14:val="standardContextual"/>
             </w:rPr>
           </w:pPr>
-          <w:hyperlink w:anchor="_Toc226914629" w:history="1">
+          <w:hyperlink w:anchor="_Toc227005791" w:history="1">
             <w:r>
               <w:rPr>
                 <w:rStyle w:val="Hypertextovodkaz"/>
@@ -840,7 +840,7 @@
                 <w:noProof/>
                 <w:webHidden/>
               </w:rPr>
-              <w:instrText xml:space="preserve"> PAGEREF _Toc226914629 \h </w:instrText>
+              <w:instrText xml:space="preserve"> PAGEREF _Toc227005791 \h </w:instrText>
             </w:r>
             <w:r>
               <w:rPr>
@@ -886,7 +886,7 @@
               <w14:ligatures w14:val="standardContextual"/>
             </w:rPr>
           </w:pPr>
-          <w:hyperlink w:anchor="_Toc226914630" w:history="1">
+          <w:hyperlink w:anchor="_Toc227005792" w:history="1">
             <w:r>
               <w:rPr>
                 <w:rStyle w:val="Hypertextovodkaz"/>
@@ -913,7 +913,7 @@
                 <w:noProof/>
                 <w:webHidden/>
               </w:rPr>
-              <w:instrText xml:space="preserve"> PAGEREF _Toc226914630 \h </w:instrText>
+              <w:instrText xml:space="preserve"> PAGEREF _Toc227005792 \h </w:instrText>
             </w:r>
             <w:r>
               <w:rPr>
@@ -959,7 +959,7 @@
               <w14:ligatures w14:val="standardContextual"/>
             </w:rPr>
           </w:pPr>
-          <w:hyperlink w:anchor="_Toc226914631" w:history="1">
+          <w:hyperlink w:anchor="_Toc227005793" w:history="1">
             <w:r>
               <w:rPr>
                 <w:rStyle w:val="Hypertextovodkaz"/>
@@ -986,7 +986,7 @@
                 <w:noProof/>
                 <w:webHidden/>
               </w:rPr>
-              <w:instrText xml:space="preserve"> PAGEREF _Toc226914631 \h </w:instrText>
+              <w:instrText xml:space="preserve"> PAGEREF _Toc227005793 \h </w:instrText>
             </w:r>
             <w:r>
               <w:rPr>
@@ -1032,7 +1032,7 @@
               <w14:ligatures w14:val="standardContextual"/>
             </w:rPr>
           </w:pPr>
-          <w:hyperlink w:anchor="_Toc226914632" w:history="1">
+          <w:hyperlink w:anchor="_Toc227005794" w:history="1">
             <w:r>
               <w:rPr>
                 <w:rStyle w:val="Hypertextovodkaz"/>
@@ -1059,7 +1059,7 @@
                 <w:noProof/>
                 <w:webHidden/>
               </w:rPr>
-              <w:instrText xml:space="preserve"> PAGEREF _Toc226914632 \h </w:instrText>
+              <w:instrText xml:space="preserve"> PAGEREF _Toc227005794 \h </w:instrText>
             </w:r>
             <w:r>
               <w:rPr>
@@ -1105,7 +1105,7 @@
               <w14:ligatures w14:val="standardContextual"/>
             </w:rPr>
           </w:pPr>
-          <w:hyperlink w:anchor="_Toc226914633" w:history="1">
+          <w:hyperlink w:anchor="_Toc227005795" w:history="1">
             <w:r>
               <w:rPr>
                 <w:rStyle w:val="Hypertextovodkaz"/>
@@ -1132,7 +1132,7 @@
                 <w:noProof/>
                 <w:webHidden/>
               </w:rPr>
-              <w:instrText xml:space="preserve"> PAGEREF _Toc226914633 \h </w:instrText>
+              <w:instrText xml:space="preserve"> PAGEREF _Toc227005795 \h </w:instrText>
             </w:r>
             <w:r>
               <w:rPr>
@@ -1178,7 +1178,7 @@
               <w14:ligatures w14:val="standardContextual"/>
             </w:rPr>
           </w:pPr>
-          <w:hyperlink w:anchor="_Toc226914634" w:history="1">
+          <w:hyperlink w:anchor="_Toc227005796" w:history="1">
             <w:r>
               <w:rPr>
                 <w:rStyle w:val="Hypertextovodkaz"/>
@@ -1205,7 +1205,7 @@
                 <w:noProof/>
                 <w:webHidden/>
               </w:rPr>
-              <w:instrText xml:space="preserve"> PAGEREF _Toc226914634 \h </w:instrText>
+              <w:instrText xml:space="preserve"> PAGEREF _Toc227005796 \h </w:instrText>
             </w:r>
             <w:r>
               <w:rPr>
@@ -1251,7 +1251,7 @@
               <w14:ligatures w14:val="standardContextual"/>
             </w:rPr>
           </w:pPr>
-          <w:hyperlink w:anchor="_Toc226914635" w:history="1">
+          <w:hyperlink w:anchor="_Toc227005797" w:history="1">
             <w:r>
               <w:rPr>
                 <w:rStyle w:val="Hypertextovodkaz"/>
@@ -1278,7 +1278,7 @@
                 <w:noProof/>
                 <w:webHidden/>
               </w:rPr>
-              <w:instrText xml:space="preserve"> PAGEREF _Toc226914635 \h </w:instrText>
+              <w:instrText xml:space="preserve"> PAGEREF _Toc227005797 \h </w:instrText>
             </w:r>
             <w:r>
               <w:rPr>
@@ -1324,7 +1324,7 @@
               <w14:ligatures w14:val="standardContextual"/>
             </w:rPr>
           </w:pPr>
-          <w:hyperlink w:anchor="_Toc226914636" w:history="1">
+          <w:hyperlink w:anchor="_Toc227005798" w:history="1">
             <w:r>
               <w:rPr>
                 <w:rStyle w:val="Hypertextovodkaz"/>
@@ -1351,7 +1351,7 @@
                 <w:noProof/>
                 <w:webHidden/>
               </w:rPr>
-              <w:instrText xml:space="preserve"> PAGEREF _Toc226914636 \h </w:instrText>
+              <w:instrText xml:space="preserve"> PAGEREF _Toc227005798 \h </w:instrText>
             </w:r>
             <w:r>
               <w:rPr>
@@ -1397,7 +1397,7 @@
               <w14:ligatures w14:val="standardContextual"/>
             </w:rPr>
           </w:pPr>
-          <w:hyperlink w:anchor="_Toc226914637" w:history="1">
+          <w:hyperlink w:anchor="_Toc227005799" w:history="1">
             <w:r>
               <w:rPr>
                 <w:rStyle w:val="Hypertextovodkaz"/>
@@ -1424,7 +1424,7 @@
                 <w:noProof/>
                 <w:webHidden/>
               </w:rPr>
-              <w:instrText xml:space="preserve"> PAGEREF _Toc226914637 \h </w:instrText>
+              <w:instrText xml:space="preserve"> PAGEREF _Toc227005799 \h </w:instrText>
             </w:r>
             <w:r>
               <w:rPr>
@@ -1470,7 +1470,7 @@
               <w14:ligatures w14:val="standardContextual"/>
             </w:rPr>
           </w:pPr>
-          <w:hyperlink w:anchor="_Toc226914638" w:history="1">
+          <w:hyperlink w:anchor="_Toc227005800" w:history="1">
             <w:r>
               <w:rPr>
                 <w:rStyle w:val="Hypertextovodkaz"/>
@@ -1497,7 +1497,7 @@
                 <w:noProof/>
                 <w:webHidden/>
               </w:rPr>
-              <w:instrText xml:space="preserve"> PAGEREF _Toc226914638 \h </w:instrText>
+              <w:instrText xml:space="preserve"> PAGEREF _Toc227005800 \h </w:instrText>
             </w:r>
             <w:r>
               <w:rPr>
@@ -1543,7 +1543,7 @@
               <w14:ligatures w14:val="standardContextual"/>
             </w:rPr>
           </w:pPr>
-          <w:hyperlink w:anchor="_Toc226914639" w:history="1">
+          <w:hyperlink w:anchor="_Toc227005801" w:history="1">
             <w:r>
               <w:rPr>
                 <w:rStyle w:val="Hypertextovodkaz"/>
@@ -1570,7 +1570,7 @@
                 <w:noProof/>
                 <w:webHidden/>
               </w:rPr>
-              <w:instrText xml:space="preserve"> PAGEREF _Toc226914639 \h </w:instrText>
+              <w:instrText xml:space="preserve"> PAGEREF _Toc227005801 \h </w:instrText>
             </w:r>
             <w:r>
               <w:rPr>
@@ -1616,7 +1616,7 @@
               <w14:ligatures w14:val="standardContextual"/>
             </w:rPr>
           </w:pPr>
-          <w:hyperlink w:anchor="_Toc226914640" w:history="1">
+          <w:hyperlink w:anchor="_Toc227005802" w:history="1">
             <w:r>
               <w:rPr>
                 <w:rStyle w:val="Hypertextovodkaz"/>
@@ -1643,7 +1643,7 @@
                 <w:noProof/>
                 <w:webHidden/>
               </w:rPr>
-              <w:instrText xml:space="preserve"> PAGEREF _Toc226914640 \h </w:instrText>
+              <w:instrText xml:space="preserve"> PAGEREF _Toc227005802 \h </w:instrText>
             </w:r>
             <w:r>
               <w:rPr>
@@ -1664,6 +1664,590 @@
                 <w:webHidden/>
               </w:rPr>
               <w:t>8</w:t>
+            </w:r>
+            <w:r>
+              <w:rPr>
+                <w:noProof/>
+                <w:webHidden/>
+              </w:rPr>
+              <w:fldChar w:fldCharType="end"/>
+            </w:r>
+          </w:hyperlink>
+        </w:p>
+        <w:p>
+          <w:pPr>
+            <w:pStyle w:val="Obsah2"/>
+            <w:tabs>
+              <w:tab w:val="right" w:leader="dot" w:pos="9176"/>
+            </w:tabs>
+            <w:rPr>
+              <w:rFonts w:asciiTheme="minorHAnsi" w:eastAsiaTheme="minorEastAsia" w:hAnsiTheme="minorHAnsi" w:cstheme="minorBidi"/>
+              <w:noProof/>
+              <w:kern w:val="2"/>
+              <w:sz w:val="24"/>
+              <w:szCs w:val="24"/>
+              <w14:ligatures w14:val="standardContextual"/>
+            </w:rPr>
+          </w:pPr>
+          <w:hyperlink w:anchor="_Toc227005803" w:history="1">
+            <w:r>
+              <w:rPr>
+                <w:rStyle w:val="Hypertextovodkaz"/>
+                <w:noProof/>
+              </w:rPr>
+              <w:t>5.1. Přehled aplikace</w:t>
+            </w:r>
+            <w:r>
+              <w:rPr>
+                <w:noProof/>
+                <w:webHidden/>
+              </w:rPr>
+              <w:tab/>
+            </w:r>
+            <w:r>
+              <w:rPr>
+                <w:noProof/>
+                <w:webHidden/>
+              </w:rPr>
+              <w:fldChar w:fldCharType="begin"/>
+            </w:r>
+            <w:r>
+              <w:rPr>
+                <w:noProof/>
+                <w:webHidden/>
+              </w:rPr>
+              <w:instrText xml:space="preserve"> PAGEREF _Toc227005803 \h </w:instrText>
+            </w:r>
+            <w:r>
+              <w:rPr>
+                <w:noProof/>
+                <w:webHidden/>
+              </w:rPr>
+            </w:r>
+            <w:r>
+              <w:rPr>
+                <w:noProof/>
+                <w:webHidden/>
+              </w:rPr>
+              <w:fldChar w:fldCharType="separate"/>
+            </w:r>
+            <w:r>
+              <w:rPr>
+                <w:noProof/>
+                <w:webHidden/>
+              </w:rPr>
+              <w:t>8</w:t>
+            </w:r>
+            <w:r>
+              <w:rPr>
+                <w:noProof/>
+                <w:webHidden/>
+              </w:rPr>
+              <w:fldChar w:fldCharType="end"/>
+            </w:r>
+          </w:hyperlink>
+        </w:p>
+        <w:p>
+          <w:pPr>
+            <w:pStyle w:val="Obsah2"/>
+            <w:tabs>
+              <w:tab w:val="right" w:leader="dot" w:pos="9176"/>
+            </w:tabs>
+            <w:rPr>
+              <w:rFonts w:asciiTheme="minorHAnsi" w:eastAsiaTheme="minorEastAsia" w:hAnsiTheme="minorHAnsi" w:cstheme="minorBidi"/>
+              <w:noProof/>
+              <w:kern w:val="2"/>
+              <w:sz w:val="24"/>
+              <w:szCs w:val="24"/>
+              <w14:ligatures w14:val="standardContextual"/>
+            </w:rPr>
+          </w:pPr>
+          <w:hyperlink w:anchor="_Toc227005804" w:history="1">
+            <w:r>
+              <w:rPr>
+                <w:rStyle w:val="Hypertextovodkaz"/>
+                <w:noProof/>
+              </w:rPr>
+              <w:t>5.2. Architektura a závislosti</w:t>
+            </w:r>
+            <w:r>
+              <w:rPr>
+                <w:noProof/>
+                <w:webHidden/>
+              </w:rPr>
+              <w:tab/>
+            </w:r>
+            <w:r>
+              <w:rPr>
+                <w:noProof/>
+                <w:webHidden/>
+              </w:rPr>
+              <w:fldChar w:fldCharType="begin"/>
+            </w:r>
+            <w:r>
+              <w:rPr>
+                <w:noProof/>
+                <w:webHidden/>
+              </w:rPr>
+              <w:instrText xml:space="preserve"> PAGEREF _Toc227005804 \h </w:instrText>
+            </w:r>
+            <w:r>
+              <w:rPr>
+                <w:noProof/>
+                <w:webHidden/>
+              </w:rPr>
+            </w:r>
+            <w:r>
+              <w:rPr>
+                <w:noProof/>
+                <w:webHidden/>
+              </w:rPr>
+              <w:fldChar w:fldCharType="separate"/>
+            </w:r>
+            <w:r>
+              <w:rPr>
+                <w:noProof/>
+                <w:webHidden/>
+              </w:rPr>
+              <w:t>8</w:t>
+            </w:r>
+            <w:r>
+              <w:rPr>
+                <w:noProof/>
+                <w:webHidden/>
+              </w:rPr>
+              <w:fldChar w:fldCharType="end"/>
+            </w:r>
+          </w:hyperlink>
+        </w:p>
+        <w:p>
+          <w:pPr>
+            <w:pStyle w:val="Obsah2"/>
+            <w:tabs>
+              <w:tab w:val="right" w:leader="dot" w:pos="9176"/>
+            </w:tabs>
+            <w:rPr>
+              <w:rFonts w:asciiTheme="minorHAnsi" w:eastAsiaTheme="minorEastAsia" w:hAnsiTheme="minorHAnsi" w:cstheme="minorBidi"/>
+              <w:noProof/>
+              <w:kern w:val="2"/>
+              <w:sz w:val="24"/>
+              <w:szCs w:val="24"/>
+              <w14:ligatures w14:val="standardContextual"/>
+            </w:rPr>
+          </w:pPr>
+          <w:hyperlink w:anchor="_Toc227005805" w:history="1">
+            <w:r>
+              <w:rPr>
+                <w:rStyle w:val="Hypertextovodkaz"/>
+                <w:noProof/>
+              </w:rPr>
+              <w:t>5.3. Struktura adresáře app</w:t>
+            </w:r>
+            <w:r>
+              <w:rPr>
+                <w:noProof/>
+                <w:webHidden/>
+              </w:rPr>
+              <w:tab/>
+            </w:r>
+            <w:r>
+              <w:rPr>
+                <w:noProof/>
+                <w:webHidden/>
+              </w:rPr>
+              <w:fldChar w:fldCharType="begin"/>
+            </w:r>
+            <w:r>
+              <w:rPr>
+                <w:noProof/>
+                <w:webHidden/>
+              </w:rPr>
+              <w:instrText xml:space="preserve"> PAGEREF _Toc227005805 \h </w:instrText>
+            </w:r>
+            <w:r>
+              <w:rPr>
+                <w:noProof/>
+                <w:webHidden/>
+              </w:rPr>
+            </w:r>
+            <w:r>
+              <w:rPr>
+                <w:noProof/>
+                <w:webHidden/>
+              </w:rPr>
+              <w:fldChar w:fldCharType="separate"/>
+            </w:r>
+            <w:r>
+              <w:rPr>
+                <w:noProof/>
+                <w:webHidden/>
+              </w:rPr>
+              <w:t>9</w:t>
+            </w:r>
+            <w:r>
+              <w:rPr>
+                <w:noProof/>
+                <w:webHidden/>
+              </w:rPr>
+              <w:fldChar w:fldCharType="end"/>
+            </w:r>
+          </w:hyperlink>
+        </w:p>
+        <w:p>
+          <w:pPr>
+            <w:pStyle w:val="Obsah2"/>
+            <w:tabs>
+              <w:tab w:val="right" w:leader="dot" w:pos="9176"/>
+            </w:tabs>
+            <w:rPr>
+              <w:rFonts w:asciiTheme="minorHAnsi" w:eastAsiaTheme="minorEastAsia" w:hAnsiTheme="minorHAnsi" w:cstheme="minorBidi"/>
+              <w:noProof/>
+              <w:kern w:val="2"/>
+              <w:sz w:val="24"/>
+              <w:szCs w:val="24"/>
+              <w14:ligatures w14:val="standardContextual"/>
+            </w:rPr>
+          </w:pPr>
+          <w:hyperlink w:anchor="_Toc227005806" w:history="1">
+            <w:r>
+              <w:rPr>
+                <w:rStyle w:val="Hypertextovodkaz"/>
+                <w:noProof/>
+              </w:rPr>
+              <w:t>5.4. Uživatelský tok aplikace</w:t>
+            </w:r>
+            <w:r>
+              <w:rPr>
+                <w:noProof/>
+                <w:webHidden/>
+              </w:rPr>
+              <w:tab/>
+            </w:r>
+            <w:r>
+              <w:rPr>
+                <w:noProof/>
+                <w:webHidden/>
+              </w:rPr>
+              <w:fldChar w:fldCharType="begin"/>
+            </w:r>
+            <w:r>
+              <w:rPr>
+                <w:noProof/>
+                <w:webHidden/>
+              </w:rPr>
+              <w:instrText xml:space="preserve"> PAGEREF _Toc227005806 \h </w:instrText>
+            </w:r>
+            <w:r>
+              <w:rPr>
+                <w:noProof/>
+                <w:webHidden/>
+              </w:rPr>
+            </w:r>
+            <w:r>
+              <w:rPr>
+                <w:noProof/>
+                <w:webHidden/>
+              </w:rPr>
+              <w:fldChar w:fldCharType="separate"/>
+            </w:r>
+            <w:r>
+              <w:rPr>
+                <w:noProof/>
+                <w:webHidden/>
+              </w:rPr>
+              <w:t>9</w:t>
+            </w:r>
+            <w:r>
+              <w:rPr>
+                <w:noProof/>
+                <w:webHidden/>
+              </w:rPr>
+              <w:fldChar w:fldCharType="end"/>
+            </w:r>
+          </w:hyperlink>
+        </w:p>
+        <w:p>
+          <w:pPr>
+            <w:pStyle w:val="Obsah2"/>
+            <w:tabs>
+              <w:tab w:val="right" w:leader="dot" w:pos="9176"/>
+            </w:tabs>
+            <w:rPr>
+              <w:rFonts w:asciiTheme="minorHAnsi" w:eastAsiaTheme="minorEastAsia" w:hAnsiTheme="minorHAnsi" w:cstheme="minorBidi"/>
+              <w:noProof/>
+              <w:kern w:val="2"/>
+              <w:sz w:val="24"/>
+              <w:szCs w:val="24"/>
+              <w14:ligatures w14:val="standardContextual"/>
+            </w:rPr>
+          </w:pPr>
+          <w:hyperlink w:anchor="_Toc227005807" w:history="1">
+            <w:r>
+              <w:rPr>
+                <w:rStyle w:val="Hypertextovodkaz"/>
+                <w:noProof/>
+              </w:rPr>
+              <w:t>5.5. Detail jednotlivých stránek</w:t>
+            </w:r>
+            <w:r>
+              <w:rPr>
+                <w:noProof/>
+                <w:webHidden/>
+              </w:rPr>
+              <w:tab/>
+            </w:r>
+            <w:r>
+              <w:rPr>
+                <w:noProof/>
+                <w:webHidden/>
+              </w:rPr>
+              <w:fldChar w:fldCharType="begin"/>
+            </w:r>
+            <w:r>
+              <w:rPr>
+                <w:noProof/>
+                <w:webHidden/>
+              </w:rPr>
+              <w:instrText xml:space="preserve"> PAGEREF _Toc227005807 \h </w:instrText>
+            </w:r>
+            <w:r>
+              <w:rPr>
+                <w:noProof/>
+                <w:webHidden/>
+              </w:rPr>
+            </w:r>
+            <w:r>
+              <w:rPr>
+                <w:noProof/>
+                <w:webHidden/>
+              </w:rPr>
+              <w:fldChar w:fldCharType="separate"/>
+            </w:r>
+            <w:r>
+              <w:rPr>
+                <w:noProof/>
+                <w:webHidden/>
+              </w:rPr>
+              <w:t>9</w:t>
+            </w:r>
+            <w:r>
+              <w:rPr>
+                <w:noProof/>
+                <w:webHidden/>
+              </w:rPr>
+              <w:fldChar w:fldCharType="end"/>
+            </w:r>
+          </w:hyperlink>
+        </w:p>
+        <w:p>
+          <w:pPr>
+            <w:pStyle w:val="Obsah2"/>
+            <w:tabs>
+              <w:tab w:val="right" w:leader="dot" w:pos="9176"/>
+            </w:tabs>
+            <w:rPr>
+              <w:rFonts w:asciiTheme="minorHAnsi" w:eastAsiaTheme="minorEastAsia" w:hAnsiTheme="minorHAnsi" w:cstheme="minorBidi"/>
+              <w:noProof/>
+              <w:kern w:val="2"/>
+              <w:sz w:val="24"/>
+              <w:szCs w:val="24"/>
+              <w14:ligatures w14:val="standardContextual"/>
+            </w:rPr>
+          </w:pPr>
+          <w:hyperlink w:anchor="_Toc227005808" w:history="1">
+            <w:r>
+              <w:rPr>
+                <w:rStyle w:val="Hypertextovodkaz"/>
+                <w:noProof/>
+              </w:rPr>
+              <w:t>5.6. Databázový model používaný aplikací</w:t>
+            </w:r>
+            <w:r>
+              <w:rPr>
+                <w:noProof/>
+                <w:webHidden/>
+              </w:rPr>
+              <w:tab/>
+            </w:r>
+            <w:r>
+              <w:rPr>
+                <w:noProof/>
+                <w:webHidden/>
+              </w:rPr>
+              <w:fldChar w:fldCharType="begin"/>
+            </w:r>
+            <w:r>
+              <w:rPr>
+                <w:noProof/>
+                <w:webHidden/>
+              </w:rPr>
+              <w:instrText xml:space="preserve"> PAGEREF _Toc227005808 \h </w:instrText>
+            </w:r>
+            <w:r>
+              <w:rPr>
+                <w:noProof/>
+                <w:webHidden/>
+              </w:rPr>
+            </w:r>
+            <w:r>
+              <w:rPr>
+                <w:noProof/>
+                <w:webHidden/>
+              </w:rPr>
+              <w:fldChar w:fldCharType="separate"/>
+            </w:r>
+            <w:r>
+              <w:rPr>
+                <w:noProof/>
+                <w:webHidden/>
+              </w:rPr>
+              <w:t>10</w:t>
+            </w:r>
+            <w:r>
+              <w:rPr>
+                <w:noProof/>
+                <w:webHidden/>
+              </w:rPr>
+              <w:fldChar w:fldCharType="end"/>
+            </w:r>
+          </w:hyperlink>
+        </w:p>
+        <w:p>
+          <w:pPr>
+            <w:pStyle w:val="Obsah2"/>
+            <w:tabs>
+              <w:tab w:val="right" w:leader="dot" w:pos="9176"/>
+            </w:tabs>
+            <w:rPr>
+              <w:rFonts w:asciiTheme="minorHAnsi" w:eastAsiaTheme="minorEastAsia" w:hAnsiTheme="minorHAnsi" w:cstheme="minorBidi"/>
+              <w:noProof/>
+              <w:kern w:val="2"/>
+              <w:sz w:val="24"/>
+              <w:szCs w:val="24"/>
+              <w14:ligatures w14:val="standardContextual"/>
+            </w:rPr>
+          </w:pPr>
+          <w:hyperlink w:anchor="_Toc227005809" w:history="1">
+            <w:r>
+              <w:rPr>
+                <w:rStyle w:val="Hypertextovodkaz"/>
+                <w:noProof/>
+              </w:rPr>
+              <w:t>5.7. Konfigurace a spuštění</w:t>
+            </w:r>
+            <w:r>
+              <w:rPr>
+                <w:noProof/>
+                <w:webHidden/>
+              </w:rPr>
+              <w:tab/>
+            </w:r>
+            <w:r>
+              <w:rPr>
+                <w:noProof/>
+                <w:webHidden/>
+              </w:rPr>
+              <w:fldChar w:fldCharType="begin"/>
+            </w:r>
+            <w:r>
+              <w:rPr>
+                <w:noProof/>
+                <w:webHidden/>
+              </w:rPr>
+              <w:instrText xml:space="preserve"> PAGEREF _Toc227005809 \h </w:instrText>
+            </w:r>
+            <w:r>
+              <w:rPr>
+                <w:noProof/>
+                <w:webHidden/>
+              </w:rPr>
+            </w:r>
+            <w:r>
+              <w:rPr>
+                <w:noProof/>
+                <w:webHidden/>
+              </w:rPr>
+              <w:fldChar w:fldCharType="separate"/>
+            </w:r>
+            <w:r>
+              <w:rPr>
+                <w:noProof/>
+                <w:webHidden/>
+              </w:rPr>
+              <w:t>10</w:t>
+            </w:r>
+            <w:r>
+              <w:rPr>
+                <w:noProof/>
+                <w:webHidden/>
+              </w:rPr>
+              <w:fldChar w:fldCharType="end"/>
+            </w:r>
+          </w:hyperlink>
+        </w:p>
+        <w:p>
+          <w:pPr>
+            <w:pStyle w:val="Obsah2"/>
+            <w:tabs>
+              <w:tab w:val="right" w:leader="dot" w:pos="9176"/>
+            </w:tabs>
+            <w:rPr>
+              <w:rFonts w:asciiTheme="minorHAnsi" w:eastAsiaTheme="minorEastAsia" w:hAnsiTheme="minorHAnsi" w:cstheme="minorBidi"/>
+              <w:noProof/>
+              <w:kern w:val="2"/>
+              <w:sz w:val="24"/>
+              <w:szCs w:val="24"/>
+              <w14:ligatures w14:val="standardContextual"/>
+            </w:rPr>
+          </w:pPr>
+          <w:hyperlink w:anchor="_Toc227005810" w:history="1">
+            <w:r>
+              <w:rPr>
+                <w:rStyle w:val="Hypertextovodkaz"/>
+                <w:noProof/>
+              </w:rPr>
+              <w:t>5.8. Bezpečnostní vlastnosti</w:t>
+            </w:r>
+            <w:r>
+              <w:rPr>
+                <w:noProof/>
+                <w:webHidden/>
+              </w:rPr>
+              <w:tab/>
+            </w:r>
+            <w:r>
+              <w:rPr>
+                <w:noProof/>
+                <w:webHidden/>
+              </w:rPr>
+              <w:fldChar w:fldCharType="begin"/>
+            </w:r>
+            <w:r>
+              <w:rPr>
+                <w:noProof/>
+                <w:webHidden/>
+              </w:rPr>
+              <w:instrText xml:space="preserve"> PAGEREF _Toc227005810 \h </w:instrText>
+            </w:r>
+            <w:r>
+              <w:rPr>
+                <w:noProof/>
+                <w:webHidden/>
+              </w:rPr>
+            </w:r>
+            <w:r>
+              <w:rPr>
+                <w:noProof/>
+                <w:webHidden/>
+              </w:rPr>
+              <w:fldChar w:fldCharType="separate"/>
+            </w:r>
+            <w:r>
+              <w:rPr>
+                <w:noProof/>
+                <w:webHidden/>
+              </w:rPr>
+              <w:t>10</w:t>
             </w:r>
             <w:r>
               <w:rPr>
@@ -1689,7 +2273,7 @@
               <w14:ligatures w14:val="standardContextual"/>
             </w:rPr>
           </w:pPr>
-          <w:hyperlink w:anchor="_Toc226914641" w:history="1">
+          <w:hyperlink w:anchor="_Toc227005811" w:history="1">
             <w:r>
               <w:rPr>
                 <w:rStyle w:val="Hypertextovodkaz"/>
@@ -1716,7 +2300,7 @@
                 <w:noProof/>
                 <w:webHidden/>
               </w:rPr>
-              <w:instrText xml:space="preserve"> PAGEREF _Toc226914641 \h </w:instrText>
+              <w:instrText xml:space="preserve"> PAGEREF _Toc227005811 \h </w:instrText>
             </w:r>
             <w:r>
               <w:rPr>
@@ -1736,7 +2320,7 @@
                 <w:noProof/>
                 <w:webHidden/>
               </w:rPr>
-              <w:t>9</w:t>
+              <w:t>11</w:t>
             </w:r>
             <w:r>
               <w:rPr>
@@ -1762,7 +2346,7 @@
               <w14:ligatures w14:val="standardContextual"/>
             </w:rPr>
           </w:pPr>
-          <w:hyperlink w:anchor="_Toc226914642" w:history="1">
+          <w:hyperlink w:anchor="_Toc227005812" w:history="1">
             <w:r>
               <w:rPr>
                 <w:rStyle w:val="Hypertextovodkaz"/>
@@ -1789,7 +2373,7 @@
                 <w:noProof/>
                 <w:webHidden/>
               </w:rPr>
-              <w:instrText xml:space="preserve"> PAGEREF _Toc226914642 \h </w:instrText>
+              <w:instrText xml:space="preserve"> PAGEREF _Toc227005812 \h </w:instrText>
             </w:r>
             <w:r>
               <w:rPr>
@@ -1809,7 +2393,7 @@
                 <w:noProof/>
                 <w:webHidden/>
               </w:rPr>
-              <w:t>9</w:t>
+              <w:t>11</w:t>
             </w:r>
             <w:r>
               <w:rPr>
@@ -1835,7 +2419,7 @@
               <w14:ligatures w14:val="standardContextual"/>
             </w:rPr>
           </w:pPr>
-          <w:hyperlink w:anchor="_Toc226914643" w:history="1">
+          <w:hyperlink w:anchor="_Toc227005813" w:history="1">
             <w:r>
               <w:rPr>
                 <w:rStyle w:val="Hypertextovodkaz"/>
@@ -1862,7 +2446,7 @@
                 <w:noProof/>
                 <w:webHidden/>
               </w:rPr>
-              <w:instrText xml:space="preserve"> PAGEREF _Toc226914643 \h </w:instrText>
+              <w:instrText xml:space="preserve"> PAGEREF _Toc227005813 \h </w:instrText>
             </w:r>
             <w:r>
               <w:rPr>
@@ -1882,7 +2466,7 @@
                 <w:noProof/>
                 <w:webHidden/>
               </w:rPr>
-              <w:t>9</w:t>
+              <w:t>11</w:t>
             </w:r>
             <w:r>
               <w:rPr>
@@ -1908,7 +2492,7 @@
               <w14:ligatures w14:val="standardContextual"/>
             </w:rPr>
           </w:pPr>
-          <w:hyperlink w:anchor="_Toc226914644" w:history="1">
+          <w:hyperlink w:anchor="_Toc227005814" w:history="1">
             <w:r>
               <w:rPr>
                 <w:rStyle w:val="Hypertextovodkaz"/>
@@ -1935,7 +2519,7 @@
                 <w:noProof/>
                 <w:webHidden/>
               </w:rPr>
-              <w:instrText xml:space="preserve"> PAGEREF _Toc226914644 \h </w:instrText>
+              <w:instrText xml:space="preserve"> PAGEREF _Toc227005814 \h </w:instrText>
             </w:r>
             <w:r>
               <w:rPr>
@@ -1955,7 +2539,7 @@
                 <w:noProof/>
                 <w:webHidden/>
               </w:rPr>
-              <w:t>9</w:t>
+              <w:t>11</w:t>
             </w:r>
             <w:r>
               <w:rPr>
@@ -1981,7 +2565,7 @@
               <w14:ligatures w14:val="standardContextual"/>
             </w:rPr>
           </w:pPr>
-          <w:hyperlink w:anchor="_Toc226914645" w:history="1">
+          <w:hyperlink w:anchor="_Toc227005815" w:history="1">
             <w:r>
               <w:rPr>
                 <w:rStyle w:val="Hypertextovodkaz"/>
@@ -2008,7 +2592,7 @@
                 <w:noProof/>
                 <w:webHidden/>
               </w:rPr>
-              <w:instrText xml:space="preserve"> PAGEREF _Toc226914645 \h </w:instrText>
+              <w:instrText xml:space="preserve"> PAGEREF _Toc227005815 \h </w:instrText>
             </w:r>
             <w:r>
               <w:rPr>
@@ -2028,7 +2612,7 @@
                 <w:noProof/>
                 <w:webHidden/>
               </w:rPr>
-              <w:t>10</w:t>
+              <w:t>12</w:t>
             </w:r>
             <w:r>
               <w:rPr>
@@ -2054,7 +2638,7 @@
               <w14:ligatures w14:val="standardContextual"/>
             </w:rPr>
           </w:pPr>
-          <w:hyperlink w:anchor="_Toc226914646" w:history="1">
+          <w:hyperlink w:anchor="_Toc227005816" w:history="1">
             <w:r>
               <w:rPr>
                 <w:rStyle w:val="Hypertextovodkaz"/>
@@ -2081,7 +2665,7 @@
                 <w:noProof/>
                 <w:webHidden/>
               </w:rPr>
-              <w:instrText xml:space="preserve"> PAGEREF _Toc226914646 \h </w:instrText>
+              <w:instrText xml:space="preserve"> PAGEREF _Toc227005816 \h </w:instrText>
             </w:r>
             <w:r>
               <w:rPr>
@@ -2101,7 +2685,7 @@
                 <w:noProof/>
                 <w:webHidden/>
               </w:rPr>
-              <w:t>10</w:t>
+              <w:t>12</w:t>
             </w:r>
             <w:r>
               <w:rPr>
@@ -2127,7 +2711,7 @@
               <w14:ligatures w14:val="standardContextual"/>
             </w:rPr>
           </w:pPr>
-          <w:hyperlink w:anchor="_Toc226914647" w:history="1">
+          <w:hyperlink w:anchor="_Toc227005817" w:history="1">
             <w:r>
               <w:rPr>
                 <w:rStyle w:val="Hypertextovodkaz"/>
@@ -2154,7 +2738,7 @@
                 <w:noProof/>
                 <w:webHidden/>
               </w:rPr>
-              <w:instrText xml:space="preserve"> PAGEREF _Toc226914647 \h </w:instrText>
+              <w:instrText xml:space="preserve"> PAGEREF _Toc227005817 \h </w:instrText>
             </w:r>
             <w:r>
               <w:rPr>
@@ -2174,7 +2758,7 @@
                 <w:noProof/>
                 <w:webHidden/>
               </w:rPr>
-              <w:t>10</w:t>
+              <w:t>12</w:t>
             </w:r>
             <w:r>
               <w:rPr>
@@ -2200,7 +2784,7 @@
               <w14:ligatures w14:val="standardContextual"/>
             </w:rPr>
           </w:pPr>
-          <w:hyperlink w:anchor="_Toc226914648" w:history="1">
+          <w:hyperlink w:anchor="_Toc227005818" w:history="1">
             <w:r>
               <w:rPr>
                 <w:rStyle w:val="Hypertextovodkaz"/>
@@ -2227,7 +2811,7 @@
                 <w:noProof/>
                 <w:webHidden/>
               </w:rPr>
-              <w:instrText xml:space="preserve"> PAGEREF _Toc226914648 \h </w:instrText>
+              <w:instrText xml:space="preserve"> PAGEREF _Toc227005818 \h </w:instrText>
             </w:r>
             <w:r>
               <w:rPr>
@@ -2247,7 +2831,7 @@
                 <w:noProof/>
                 <w:webHidden/>
               </w:rPr>
-              <w:t>11</w:t>
+              <w:t>13</w:t>
             </w:r>
             <w:r>
               <w:rPr>
@@ -2273,7 +2857,7 @@
               <w14:ligatures w14:val="standardContextual"/>
             </w:rPr>
           </w:pPr>
-          <w:hyperlink w:anchor="_Toc226914649" w:history="1">
+          <w:hyperlink w:anchor="_Toc227005819" w:history="1">
             <w:r>
               <w:rPr>
                 <w:rStyle w:val="Hypertextovodkaz"/>
@@ -2300,7 +2884,7 @@
                 <w:noProof/>
                 <w:webHidden/>
               </w:rPr>
-              <w:instrText xml:space="preserve"> PAGEREF _Toc226914649 \h </w:instrText>
+              <w:instrText xml:space="preserve"> PAGEREF _Toc227005819 \h </w:instrText>
             </w:r>
             <w:r>
               <w:rPr>
@@ -2320,7 +2904,7 @@
                 <w:noProof/>
                 <w:webHidden/>
               </w:rPr>
-              <w:t>11</w:t>
+              <w:t>13</w:t>
             </w:r>
             <w:r>
               <w:rPr>
@@ -2346,7 +2930,7 @@
               <w14:ligatures w14:val="standardContextual"/>
             </w:rPr>
           </w:pPr>
-          <w:hyperlink w:anchor="_Toc226914650" w:history="1">
+          <w:hyperlink w:anchor="_Toc227005820" w:history="1">
             <w:r>
               <w:rPr>
                 <w:rStyle w:val="Hypertextovodkaz"/>
@@ -2373,7 +2957,7 @@
                 <w:noProof/>
                 <w:webHidden/>
               </w:rPr>
-              <w:instrText xml:space="preserve"> PAGEREF _Toc226914650 \h </w:instrText>
+              <w:instrText xml:space="preserve"> PAGEREF _Toc227005820 \h </w:instrText>
             </w:r>
             <w:r>
               <w:rPr>
@@ -2393,7 +2977,7 @@
                 <w:noProof/>
                 <w:webHidden/>
               </w:rPr>
-              <w:t>11</w:t>
+              <w:t>13</w:t>
             </w:r>
             <w:r>
               <w:rPr>
@@ -2419,7 +3003,7 @@
               <w14:ligatures w14:val="standardContextual"/>
             </w:rPr>
           </w:pPr>
-          <w:hyperlink w:anchor="_Toc226914651" w:history="1">
+          <w:hyperlink w:anchor="_Toc227005821" w:history="1">
             <w:r>
               <w:rPr>
                 <w:rStyle w:val="Hypertextovodkaz"/>
@@ -2446,7 +3030,7 @@
                 <w:noProof/>
                 <w:webHidden/>
               </w:rPr>
-              <w:instrText xml:space="preserve"> PAGEREF _Toc226914651 \h </w:instrText>
+              <w:instrText xml:space="preserve"> PAGEREF _Toc227005821 \h </w:instrText>
             </w:r>
             <w:r>
               <w:rPr>
@@ -2466,7 +3050,7 @@
                 <w:noProof/>
                 <w:webHidden/>
               </w:rPr>
-              <w:t>12</w:t>
+              <w:t>14</w:t>
             </w:r>
             <w:r>
               <w:rPr>
@@ -2478,23 +3062,28 @@
           </w:hyperlink>
         </w:p>
         <w:p>
+          <w:pPr>
+            <w:rPr>
+              <w:b/>
+              <w:bCs/>
+            </w:rPr>
+          </w:pPr>
           <w:r>
             <w:rPr>
               <w:b/>
               <w:bCs/>
             </w:rPr>
+            <w:lastRenderedPageBreak/>
             <w:fldChar w:fldCharType="end"/>
           </w:r>
         </w:p>
       </w:sdtContent>
     </w:sdt>
-    <w:p/>
-    <w:p/>
-    <w:p/>
-    <w:p/>
-    <w:p/>
     <w:p>
       <w:pPr>
+        <w:spacing w:after="80"/>
+      </w:pPr>
+      <w:r>
         <w:rPr>
           <w:b/>
           <w:bCs/>
@@ -2502,31 +3091,6 @@
           <w:sz w:val="52"/>
           <w:szCs w:val="52"/>
         </w:rPr>
-      </w:pPr>
-      <w:r>
-        <w:rPr>
-          <w:b/>
-          <w:bCs/>
-          <w:color w:val="1F4E79"/>
-          <w:sz w:val="52"/>
-          <w:szCs w:val="52"/>
-        </w:rPr>
-        <w:br w:type="page"/>
-      </w:r>
-    </w:p>
-    <w:p>
-      <w:pPr>
-        <w:spacing w:after="80"/>
-      </w:pPr>
-      <w:r>
-        <w:rPr>
-          <w:b/>
-          <w:bCs/>
-          <w:color w:val="1F4E79"/>
-          <w:sz w:val="52"/>
-          <w:szCs w:val="52"/>
-        </w:rPr>
-        <w:lastRenderedPageBreak/>
         <w:t>Architektura</w:t>
       </w:r>
     </w:p>
@@ -2559,7 +3123,7 @@
           <w:bottom w:val="single" w:sz="10" w:space="6" w:color="2E75B6"/>
         </w:pBdr>
       </w:pPr>
-      <w:bookmarkStart w:id="0" w:name="_Toc226914621"/>
+      <w:bookmarkStart w:id="0" w:name="_Toc227005783"/>
       <w:r>
         <w:t>1. Přehled systému</w:t>
       </w:r>
@@ -2697,7 +3261,7 @@
       <w:pPr>
         <w:pStyle w:val="Nadpis2"/>
       </w:pPr>
-      <w:bookmarkStart w:id="1" w:name="_Toc226914622"/>
+      <w:bookmarkStart w:id="1" w:name="_Toc227005784"/>
       <w:r>
         <w:t>1.1 Vrstvy</w:t>
       </w:r>
@@ -2815,8 +3379,19 @@
           <w:sz w:val="18"/>
           <w:szCs w:val="18"/>
         </w:rPr>
-        <w:t xml:space="preserve"> Engine</w:t>
-      </w:r>
+        <w:t xml:space="preserve"> </w:t>
+      </w:r>
+      <w:proofErr w:type="spellStart"/>
+      <w:r>
+        <w:rPr>
+          <w:rFonts w:ascii="Courier New" w:eastAsia="Courier New" w:hAnsi="Courier New" w:cs="Courier New"/>
+          <w:color w:val="1A1A1A"/>
+          <w:sz w:val="18"/>
+          <w:szCs w:val="18"/>
+        </w:rPr>
+        <w:t>Engine</w:t>
+      </w:r>
+      <w:proofErr w:type="spellEnd"/>
     </w:p>
     <w:p>
       <w:pPr>
@@ -2851,8 +3426,19 @@
           <w:sz w:val="18"/>
           <w:szCs w:val="18"/>
         </w:rPr>
-        <w:t xml:space="preserve"> Compose</w:t>
-      </w:r>
+        <w:t xml:space="preserve"> </w:t>
+      </w:r>
+      <w:proofErr w:type="spellStart"/>
+      <w:r>
+        <w:rPr>
+          <w:rFonts w:ascii="Courier New" w:eastAsia="Courier New" w:hAnsi="Courier New" w:cs="Courier New"/>
+          <w:color w:val="1A1A1A"/>
+          <w:sz w:val="18"/>
+          <w:szCs w:val="18"/>
+        </w:rPr>
+        <w:t>Compose</w:t>
+      </w:r>
+      <w:proofErr w:type="spellEnd"/>
     </w:p>
     <w:p>
       <w:pPr>
@@ -2887,7 +3473,27 @@
           <w:sz w:val="18"/>
           <w:szCs w:val="18"/>
         </w:rPr>
-        <w:t xml:space="preserve">   (MariaDB 10.11)</w:t>
+        <w:t xml:space="preserve">   (</w:t>
+      </w:r>
+      <w:proofErr w:type="spellStart"/>
+      <w:r>
+        <w:rPr>
+          <w:rFonts w:ascii="Courier New" w:eastAsia="Courier New" w:hAnsi="Courier New" w:cs="Courier New"/>
+          <w:color w:val="1A1A1A"/>
+          <w:sz w:val="18"/>
+          <w:szCs w:val="18"/>
+        </w:rPr>
+        <w:t>MariaDB</w:t>
+      </w:r>
+      <w:proofErr w:type="spellEnd"/>
+      <w:r>
+        <w:rPr>
+          <w:rFonts w:ascii="Courier New" w:eastAsia="Courier New" w:hAnsi="Courier New" w:cs="Courier New"/>
+          <w:color w:val="1A1A1A"/>
+          <w:sz w:val="18"/>
+          <w:szCs w:val="18"/>
+        </w:rPr>
+        <w:t xml:space="preserve"> 10.11)</w:t>
       </w:r>
     </w:p>
     <w:p>
@@ -2979,7 +3585,27 @@
           <w:sz w:val="18"/>
           <w:szCs w:val="18"/>
         </w:rPr>
-        <w:t xml:space="preserve">  (vsftpd)</w:t>
+        <w:t xml:space="preserve">  (</w:t>
+      </w:r>
+      <w:proofErr w:type="spellStart"/>
+      <w:r>
+        <w:rPr>
+          <w:rFonts w:ascii="Courier New" w:eastAsia="Courier New" w:hAnsi="Courier New" w:cs="Courier New"/>
+          <w:color w:val="1A1A1A"/>
+          <w:sz w:val="18"/>
+          <w:szCs w:val="18"/>
+        </w:rPr>
+        <w:t>vsftpd</w:t>
+      </w:r>
+      <w:proofErr w:type="spellEnd"/>
+      <w:r>
+        <w:rPr>
+          <w:rFonts w:ascii="Courier New" w:eastAsia="Courier New" w:hAnsi="Courier New" w:cs="Courier New"/>
+          <w:color w:val="1A1A1A"/>
+          <w:sz w:val="18"/>
+          <w:szCs w:val="18"/>
+        </w:rPr>
+        <w:t>)</w:t>
       </w:r>
     </w:p>
     <w:p>
@@ -3018,7 +3644,7 @@
       <w:pPr>
         <w:pStyle w:val="Nadpis2"/>
       </w:pPr>
-      <w:bookmarkStart w:id="2" w:name="_Toc226914623"/>
+      <w:bookmarkStart w:id="2" w:name="_Toc227005785"/>
       <w:r>
         <w:t>1.2 Kontejnery a síťové propojení</w:t>
       </w:r>
@@ -3558,7 +4184,7 @@
       <w:pPr>
         <w:pStyle w:val="Nadpis2"/>
       </w:pPr>
-      <w:bookmarkStart w:id="3" w:name="_Toc226914624"/>
+      <w:bookmarkStart w:id="3" w:name="_Toc227005786"/>
       <w:r>
         <w:t xml:space="preserve">1.3 Sdílené </w:t>
       </w:r>
@@ -4629,6 +5255,7 @@
                 <w:sz w:val="20"/>
                 <w:szCs w:val="20"/>
               </w:rPr>
+              <w:lastRenderedPageBreak/>
               <w:t>./</w:t>
             </w:r>
             <w:proofErr w:type="spellStart"/>
@@ -4809,7 +5436,6 @@
                 <w:sz w:val="20"/>
                 <w:szCs w:val="20"/>
               </w:rPr>
-              <w:lastRenderedPageBreak/>
               <w:t>./</w:t>
             </w:r>
             <w:proofErr w:type="spellStart"/>
@@ -4998,7 +5624,7 @@
       <w:pPr>
         <w:pStyle w:val="Nadpis2"/>
       </w:pPr>
-      <w:bookmarkStart w:id="4" w:name="_Toc226914625"/>
+      <w:bookmarkStart w:id="4" w:name="_Toc227005787"/>
       <w:r>
         <w:t>1.4 Struktura adresářů projektu</w:t>
       </w:r>
@@ -5668,7 +6294,7 @@
           <w:bottom w:val="single" w:sz="10" w:space="6" w:color="2E75B6"/>
         </w:pBdr>
       </w:pPr>
-      <w:bookmarkStart w:id="5" w:name="_Toc226914626"/>
+      <w:bookmarkStart w:id="5" w:name="_Toc227005788"/>
       <w:r>
         <w:t>2. Databáze (</w:t>
       </w:r>
@@ -5716,7 +6342,7 @@
       <w:pPr>
         <w:pStyle w:val="Nadpis2"/>
       </w:pPr>
-      <w:bookmarkStart w:id="6" w:name="_Toc226914627"/>
+      <w:bookmarkStart w:id="6" w:name="_Toc227005789"/>
       <w:r>
         <w:t>2.1 Konfigurace služby</w:t>
       </w:r>
@@ -6282,7 +6908,7 @@
       <w:pPr>
         <w:pStyle w:val="Nadpis2"/>
       </w:pPr>
-      <w:bookmarkStart w:id="7" w:name="_Toc226914628"/>
+      <w:bookmarkStart w:id="7" w:name="_Toc227005790"/>
       <w:r>
         <w:t>2.2 Databázové schéma</w:t>
       </w:r>
@@ -6292,7 +6918,7 @@
       <w:pPr>
         <w:pStyle w:val="Nadpis3"/>
       </w:pPr>
-      <w:bookmarkStart w:id="8" w:name="_Toc226914629"/>
+      <w:bookmarkStart w:id="8" w:name="_Toc227005791"/>
       <w:r>
         <w:t xml:space="preserve">Tabulka </w:t>
       </w:r>
@@ -7000,7 +7626,7 @@
       <w:pPr>
         <w:pStyle w:val="Nadpis3"/>
       </w:pPr>
-      <w:bookmarkStart w:id="9" w:name="_Toc226914630"/>
+      <w:bookmarkStart w:id="9" w:name="_Toc227005792"/>
       <w:r>
         <w:t xml:space="preserve">Tabulka </w:t>
       </w:r>
@@ -7823,7 +8449,7 @@
           <w:bottom w:val="single" w:sz="10" w:space="6" w:color="2E75B6"/>
         </w:pBdr>
       </w:pPr>
-      <w:bookmarkStart w:id="10" w:name="_Toc226914631"/>
+      <w:bookmarkStart w:id="10" w:name="_Toc227005793"/>
       <w:r>
         <w:t>3. Webový server (</w:t>
       </w:r>
@@ -7871,7 +8497,7 @@
       <w:pPr>
         <w:pStyle w:val="Nadpis2"/>
       </w:pPr>
-      <w:bookmarkStart w:id="11" w:name="_Toc226914632"/>
+      <w:bookmarkStart w:id="11" w:name="_Toc227005794"/>
       <w:r>
         <w:t>3.1 Konfigurace služby</w:t>
       </w:r>
@@ -8455,7 +9081,7 @@
       <w:pPr>
         <w:pStyle w:val="Nadpis2"/>
       </w:pPr>
-      <w:bookmarkStart w:id="12" w:name="_Toc226914633"/>
+      <w:bookmarkStart w:id="12" w:name="_Toc227005795"/>
       <w:r>
         <w:t xml:space="preserve">3.2 </w:t>
       </w:r>
@@ -9229,7 +9855,7 @@
       <w:pPr>
         <w:pStyle w:val="Nadpis2"/>
       </w:pPr>
-      <w:bookmarkStart w:id="13" w:name="_Toc226914634"/>
+      <w:bookmarkStart w:id="13" w:name="_Toc227005796"/>
       <w:r>
         <w:t xml:space="preserve">3.3 SSL – </w:t>
       </w:r>
@@ -9441,7 +10067,7 @@
       <w:pPr>
         <w:pStyle w:val="Nadpis2"/>
       </w:pPr>
-      <w:bookmarkStart w:id="14" w:name="_Toc226914635"/>
+      <w:bookmarkStart w:id="14" w:name="_Toc227005797"/>
       <w:r>
         <w:t>3.4 Logování a bezpečnost</w:t>
       </w:r>
@@ -9524,7 +10150,7 @@
           <w:bottom w:val="single" w:sz="10" w:space="6" w:color="2E75B6"/>
         </w:pBdr>
       </w:pPr>
-      <w:bookmarkStart w:id="15" w:name="_Toc226914636"/>
+      <w:bookmarkStart w:id="15" w:name="_Toc227005798"/>
       <w:r>
         <w:t>4. FTP server (</w:t>
       </w:r>
@@ -9586,7 +10212,7 @@
       <w:pPr>
         <w:pStyle w:val="Nadpis2"/>
       </w:pPr>
-      <w:bookmarkStart w:id="16" w:name="_Toc226914637"/>
+      <w:bookmarkStart w:id="16" w:name="_Toc227005799"/>
       <w:r>
         <w:t>4.1 Konfigurace služby</w:t>
       </w:r>
@@ -10229,7 +10855,7 @@
       <w:pPr>
         <w:pStyle w:val="Nadpis2"/>
       </w:pPr>
-      <w:bookmarkStart w:id="17" w:name="_Toc226914638"/>
+      <w:bookmarkStart w:id="17" w:name="_Toc227005800"/>
       <w:r>
         <w:t>4.2 Autentizace přes databázi</w:t>
       </w:r>
@@ -10611,7 +11237,7 @@
       <w:pPr>
         <w:pStyle w:val="Nadpis2"/>
       </w:pPr>
-      <w:bookmarkStart w:id="18" w:name="_Toc226914639"/>
+      <w:bookmarkStart w:id="18" w:name="_Toc227005801"/>
       <w:r>
         <w:t>4.3 Mapování adresářů</w:t>
       </w:r>
@@ -11170,7 +11796,7 @@
           <w:bottom w:val="single" w:sz="10" w:space="6" w:color="2E75B6"/>
         </w:pBdr>
       </w:pPr>
-      <w:bookmarkStart w:id="19" w:name="_Toc226914640"/>
+      <w:bookmarkStart w:id="19" w:name="_Toc227005802"/>
       <w:r>
         <w:t>5</w:t>
       </w:r>
@@ -11188,15 +11814,2787 @@
       </w:r>
       <w:bookmarkEnd w:id="19"/>
     </w:p>
+    <w:p>
+      <w:pPr>
+        <w:pStyle w:val="Nadpis2"/>
+      </w:pPr>
+      <w:bookmarkStart w:id="20" w:name="_Toc227005803"/>
+      <w:r>
+        <w:t>5.</w:t>
+      </w:r>
+      <w:r>
+        <w:t>1. Přehled aplikace</w:t>
+      </w:r>
+      <w:bookmarkEnd w:id="20"/>
+    </w:p>
+    <w:p>
+      <w:r>
+        <w:t>Aplikace představuje</w:t>
+      </w:r>
+      <w:r>
+        <w:t xml:space="preserve"> jednoduché webové rozhraní pro registraci uživatele, přihlášení, odhlášení a zobrazení základního dashboardu. Aplikace je napsaná v PHP 8.2 a používá databázi </w:t>
+      </w:r>
+      <w:proofErr w:type="spellStart"/>
+      <w:r>
+        <w:t>MariaDB</w:t>
+      </w:r>
+      <w:proofErr w:type="spellEnd"/>
+      <w:r>
+        <w:t xml:space="preserve"> přes PDO. Po přihlášení uživatel vidí svůj e-mail, datum registrace, stav účtu a případně odkaz na přiřazenou doménu.</w:t>
+      </w:r>
+    </w:p>
     <w:p/>
+    <w:p>
+      <w:pPr>
+        <w:rPr>
+          <w:b/>
+          <w:bCs/>
+        </w:rPr>
+      </w:pPr>
+      <w:r>
+        <w:rPr>
+          <w:b/>
+          <w:bCs/>
+        </w:rPr>
+        <w:t>Hlavní funkce:</w:t>
+      </w:r>
+    </w:p>
+    <w:p>
+      <w:r>
+        <w:t>• úvodní stránka s navigací na registraci a přihlášení;</w:t>
+      </w:r>
+    </w:p>
+    <w:p>
+      <w:r>
+        <w:t xml:space="preserve">• registrace nového uživatele do tabulky </w:t>
+      </w:r>
+      <w:proofErr w:type="spellStart"/>
+      <w:r>
+        <w:t>uzivatele</w:t>
+      </w:r>
+      <w:proofErr w:type="spellEnd"/>
+      <w:r>
+        <w:t>;</w:t>
+      </w:r>
+    </w:p>
+    <w:p>
+      <w:r>
+        <w:t xml:space="preserve">• ověření uživatele při přihlášení pomocí </w:t>
+      </w:r>
+      <w:proofErr w:type="spellStart"/>
+      <w:r>
+        <w:t>password_verify</w:t>
+      </w:r>
+      <w:proofErr w:type="spellEnd"/>
+      <w:r>
+        <w:t>();</w:t>
+      </w:r>
+    </w:p>
+    <w:p>
+      <w:r>
+        <w:t>• správa relace pomocí PHP session;</w:t>
+      </w:r>
+    </w:p>
+    <w:p>
+      <w:r>
+        <w:t>• zobrazení uživatelských údajů a přiřazené domény po přihlášení;</w:t>
+      </w:r>
+    </w:p>
+    <w:p>
+      <w:r>
+        <w:t>• odhlášení a zrušení relace.</w:t>
+      </w:r>
+    </w:p>
+    <w:p>
+      <w:pPr>
+        <w:pStyle w:val="Nadpis2"/>
+      </w:pPr>
+      <w:bookmarkStart w:id="21" w:name="_Toc227005804"/>
+      <w:r>
+        <w:t>5.</w:t>
+      </w:r>
+      <w:r>
+        <w:t>2. Architektura a závislosti</w:t>
+      </w:r>
+      <w:bookmarkEnd w:id="21"/>
+    </w:p>
+    <w:p>
+      <w:r>
+        <w:t xml:space="preserve">Aplikace běží v kontejneru založeném na image php:8.2-apache. Databázové připojení směřuje standardně na host </w:t>
+      </w:r>
+      <w:proofErr w:type="spellStart"/>
+      <w:r>
+        <w:t>mariadb</w:t>
+      </w:r>
+      <w:proofErr w:type="spellEnd"/>
+      <w:r>
+        <w:t xml:space="preserve"> a databázi </w:t>
+      </w:r>
+      <w:proofErr w:type="spellStart"/>
+      <w:r>
+        <w:t>hosting_db</w:t>
+      </w:r>
+      <w:proofErr w:type="spellEnd"/>
+      <w:r>
+        <w:t xml:space="preserve">. Zdrojové soubory aplikace jsou do kontejneru mapované jako </w:t>
+      </w:r>
+      <w:proofErr w:type="spellStart"/>
+      <w:r>
+        <w:t>volume</w:t>
+      </w:r>
+      <w:proofErr w:type="spellEnd"/>
+      <w:r>
+        <w:t xml:space="preserve"> z adresáře </w:t>
+      </w:r>
+      <w:proofErr w:type="spellStart"/>
+      <w:r>
+        <w:t>app</w:t>
+      </w:r>
+      <w:proofErr w:type="spellEnd"/>
+      <w:r>
+        <w:t>/</w:t>
+      </w:r>
+      <w:proofErr w:type="spellStart"/>
+      <w:r>
+        <w:t>src</w:t>
+      </w:r>
+      <w:proofErr w:type="spellEnd"/>
+      <w:r>
+        <w:t xml:space="preserve"> do /var/www/html.</w:t>
+      </w:r>
+    </w:p>
     <w:p/>
+    <w:tbl>
+      <w:tblPr>
+        <w:tblStyle w:val="Mkatabulky"/>
+        <w:tblW w:w="0" w:type="auto"/>
+        <w:jc w:val="center"/>
+        <w:tblLook w:val="04A0" w:firstRow="1" w:lastRow="0" w:firstColumn="1" w:lastColumn="0" w:noHBand="0" w:noVBand="1"/>
+      </w:tblPr>
+      <w:tblGrid>
+        <w:gridCol w:w="1701"/>
+        <w:gridCol w:w="1701"/>
+        <w:gridCol w:w="2835"/>
+        <w:gridCol w:w="2268"/>
+      </w:tblGrid>
+      <w:tr>
+        <w:trPr>
+          <w:jc w:val="center"/>
+        </w:trPr>
+        <w:tc>
+          <w:tcPr>
+            <w:tcW w:w="1701" w:type="dxa"/>
+            <w:tcBorders>
+              <w:top w:val="single" w:sz="4" w:space="0" w:color="auto"/>
+              <w:left w:val="single" w:sz="4" w:space="0" w:color="auto"/>
+              <w:bottom w:val="single" w:sz="4" w:space="0" w:color="auto"/>
+              <w:right w:val="single" w:sz="4" w:space="0" w:color="auto"/>
+            </w:tcBorders>
+            <w:shd w:val="clear" w:color="auto" w:fill="2F75B5"/>
+            <w:vAlign w:val="center"/>
+            <w:hideMark/>
+          </w:tcPr>
+          <w:p>
+            <w:r>
+              <w:rPr>
+                <w:b/>
+              </w:rPr>
+              <w:t>Vrstva</w:t>
+            </w:r>
+          </w:p>
+        </w:tc>
+        <w:tc>
+          <w:tcPr>
+            <w:tcW w:w="1701" w:type="dxa"/>
+            <w:tcBorders>
+              <w:top w:val="single" w:sz="4" w:space="0" w:color="auto"/>
+              <w:left w:val="single" w:sz="4" w:space="0" w:color="auto"/>
+              <w:bottom w:val="single" w:sz="4" w:space="0" w:color="auto"/>
+              <w:right w:val="single" w:sz="4" w:space="0" w:color="auto"/>
+            </w:tcBorders>
+            <w:shd w:val="clear" w:color="auto" w:fill="2F75B5"/>
+            <w:vAlign w:val="center"/>
+            <w:hideMark/>
+          </w:tcPr>
+          <w:p>
+            <w:r>
+              <w:rPr>
+                <w:b/>
+              </w:rPr>
+              <w:t>Technologie</w:t>
+            </w:r>
+          </w:p>
+        </w:tc>
+        <w:tc>
+          <w:tcPr>
+            <w:tcW w:w="2835" w:type="dxa"/>
+            <w:tcBorders>
+              <w:top w:val="single" w:sz="4" w:space="0" w:color="auto"/>
+              <w:left w:val="single" w:sz="4" w:space="0" w:color="auto"/>
+              <w:bottom w:val="single" w:sz="4" w:space="0" w:color="auto"/>
+              <w:right w:val="single" w:sz="4" w:space="0" w:color="auto"/>
+            </w:tcBorders>
+            <w:shd w:val="clear" w:color="auto" w:fill="2F75B5"/>
+            <w:vAlign w:val="center"/>
+            <w:hideMark/>
+          </w:tcPr>
+          <w:p>
+            <w:r>
+              <w:rPr>
+                <w:b/>
+              </w:rPr>
+              <w:t>Úloha</w:t>
+            </w:r>
+          </w:p>
+        </w:tc>
+        <w:tc>
+          <w:tcPr>
+            <w:tcW w:w="2268" w:type="dxa"/>
+            <w:tcBorders>
+              <w:top w:val="single" w:sz="4" w:space="0" w:color="auto"/>
+              <w:left w:val="single" w:sz="4" w:space="0" w:color="auto"/>
+              <w:bottom w:val="single" w:sz="4" w:space="0" w:color="auto"/>
+              <w:right w:val="single" w:sz="4" w:space="0" w:color="auto"/>
+            </w:tcBorders>
+            <w:shd w:val="clear" w:color="auto" w:fill="2F75B5"/>
+            <w:vAlign w:val="center"/>
+            <w:hideMark/>
+          </w:tcPr>
+          <w:p>
+            <w:r>
+              <w:rPr>
+                <w:b/>
+              </w:rPr>
+              <w:t>Poznámka</w:t>
+            </w:r>
+          </w:p>
+        </w:tc>
+      </w:tr>
+      <w:tr>
+        <w:trPr>
+          <w:jc w:val="center"/>
+        </w:trPr>
+        <w:tc>
+          <w:tcPr>
+            <w:tcW w:w="1701" w:type="dxa"/>
+            <w:tcBorders>
+              <w:top w:val="single" w:sz="4" w:space="0" w:color="auto"/>
+              <w:left w:val="single" w:sz="4" w:space="0" w:color="auto"/>
+              <w:bottom w:val="single" w:sz="4" w:space="0" w:color="auto"/>
+              <w:right w:val="single" w:sz="4" w:space="0" w:color="auto"/>
+            </w:tcBorders>
+            <w:vAlign w:val="center"/>
+            <w:hideMark/>
+          </w:tcPr>
+          <w:p>
+            <w:proofErr w:type="spellStart"/>
+            <w:r>
+              <w:t>Frontend</w:t>
+            </w:r>
+            <w:proofErr w:type="spellEnd"/>
+          </w:p>
+        </w:tc>
+        <w:tc>
+          <w:tcPr>
+            <w:tcW w:w="1701" w:type="dxa"/>
+            <w:tcBorders>
+              <w:top w:val="single" w:sz="4" w:space="0" w:color="auto"/>
+              <w:left w:val="single" w:sz="4" w:space="0" w:color="auto"/>
+              <w:bottom w:val="single" w:sz="4" w:space="0" w:color="auto"/>
+              <w:right w:val="single" w:sz="4" w:space="0" w:color="auto"/>
+            </w:tcBorders>
+            <w:vAlign w:val="center"/>
+            <w:hideMark/>
+          </w:tcPr>
+          <w:p>
+            <w:r>
+              <w:t>HTML + CSS</w:t>
+            </w:r>
+          </w:p>
+        </w:tc>
+        <w:tc>
+          <w:tcPr>
+            <w:tcW w:w="2835" w:type="dxa"/>
+            <w:tcBorders>
+              <w:top w:val="single" w:sz="4" w:space="0" w:color="auto"/>
+              <w:left w:val="single" w:sz="4" w:space="0" w:color="auto"/>
+              <w:bottom w:val="single" w:sz="4" w:space="0" w:color="auto"/>
+              <w:right w:val="single" w:sz="4" w:space="0" w:color="auto"/>
+            </w:tcBorders>
+            <w:vAlign w:val="center"/>
+            <w:hideMark/>
+          </w:tcPr>
+          <w:p>
+            <w:r>
+              <w:t>Formuláře a jednoduché UI</w:t>
+            </w:r>
+          </w:p>
+        </w:tc>
+        <w:tc>
+          <w:tcPr>
+            <w:tcW w:w="2268" w:type="dxa"/>
+            <w:tcBorders>
+              <w:top w:val="single" w:sz="4" w:space="0" w:color="auto"/>
+              <w:left w:val="single" w:sz="4" w:space="0" w:color="auto"/>
+              <w:bottom w:val="single" w:sz="4" w:space="0" w:color="auto"/>
+              <w:right w:val="single" w:sz="4" w:space="0" w:color="auto"/>
+            </w:tcBorders>
+            <w:vAlign w:val="center"/>
+            <w:hideMark/>
+          </w:tcPr>
+          <w:p>
+            <w:r>
+              <w:t>Styl je sdílený v style.css</w:t>
+            </w:r>
+          </w:p>
+        </w:tc>
+      </w:tr>
+      <w:tr>
+        <w:trPr>
+          <w:jc w:val="center"/>
+        </w:trPr>
+        <w:tc>
+          <w:tcPr>
+            <w:tcW w:w="1701" w:type="dxa"/>
+            <w:tcBorders>
+              <w:top w:val="single" w:sz="4" w:space="0" w:color="auto"/>
+              <w:left w:val="single" w:sz="4" w:space="0" w:color="auto"/>
+              <w:bottom w:val="single" w:sz="4" w:space="0" w:color="auto"/>
+              <w:right w:val="single" w:sz="4" w:space="0" w:color="auto"/>
+            </w:tcBorders>
+            <w:vAlign w:val="center"/>
+            <w:hideMark/>
+          </w:tcPr>
+          <w:p>
+            <w:proofErr w:type="spellStart"/>
+            <w:r>
+              <w:t>Backend</w:t>
+            </w:r>
+            <w:proofErr w:type="spellEnd"/>
+          </w:p>
+        </w:tc>
+        <w:tc>
+          <w:tcPr>
+            <w:tcW w:w="1701" w:type="dxa"/>
+            <w:tcBorders>
+              <w:top w:val="single" w:sz="4" w:space="0" w:color="auto"/>
+              <w:left w:val="single" w:sz="4" w:space="0" w:color="auto"/>
+              <w:bottom w:val="single" w:sz="4" w:space="0" w:color="auto"/>
+              <w:right w:val="single" w:sz="4" w:space="0" w:color="auto"/>
+            </w:tcBorders>
+            <w:vAlign w:val="center"/>
+            <w:hideMark/>
+          </w:tcPr>
+          <w:p>
+            <w:r>
+              <w:t>PHP 8.2</w:t>
+            </w:r>
+          </w:p>
+        </w:tc>
+        <w:tc>
+          <w:tcPr>
+            <w:tcW w:w="2835" w:type="dxa"/>
+            <w:tcBorders>
+              <w:top w:val="single" w:sz="4" w:space="0" w:color="auto"/>
+              <w:left w:val="single" w:sz="4" w:space="0" w:color="auto"/>
+              <w:bottom w:val="single" w:sz="4" w:space="0" w:color="auto"/>
+              <w:right w:val="single" w:sz="4" w:space="0" w:color="auto"/>
+            </w:tcBorders>
+            <w:vAlign w:val="center"/>
+            <w:hideMark/>
+          </w:tcPr>
+          <w:p>
+            <w:r>
+              <w:t>Obsluha formulářů, session a SQL dotazy</w:t>
+            </w:r>
+          </w:p>
+        </w:tc>
+        <w:tc>
+          <w:tcPr>
+            <w:tcW w:w="2268" w:type="dxa"/>
+            <w:tcBorders>
+              <w:top w:val="single" w:sz="4" w:space="0" w:color="auto"/>
+              <w:left w:val="single" w:sz="4" w:space="0" w:color="auto"/>
+              <w:bottom w:val="single" w:sz="4" w:space="0" w:color="auto"/>
+              <w:right w:val="single" w:sz="4" w:space="0" w:color="auto"/>
+            </w:tcBorders>
+            <w:vAlign w:val="center"/>
+            <w:hideMark/>
+          </w:tcPr>
+          <w:p>
+            <w:r>
+              <w:t>Bez frameworku</w:t>
+            </w:r>
+          </w:p>
+        </w:tc>
+      </w:tr>
+      <w:tr>
+        <w:trPr>
+          <w:jc w:val="center"/>
+        </w:trPr>
+        <w:tc>
+          <w:tcPr>
+            <w:tcW w:w="1701" w:type="dxa"/>
+            <w:tcBorders>
+              <w:top w:val="single" w:sz="4" w:space="0" w:color="auto"/>
+              <w:left w:val="single" w:sz="4" w:space="0" w:color="auto"/>
+              <w:bottom w:val="single" w:sz="4" w:space="0" w:color="auto"/>
+              <w:right w:val="single" w:sz="4" w:space="0" w:color="auto"/>
+            </w:tcBorders>
+            <w:vAlign w:val="center"/>
+            <w:hideMark/>
+          </w:tcPr>
+          <w:p>
+            <w:r>
+              <w:lastRenderedPageBreak/>
+              <w:t>Databáze</w:t>
+            </w:r>
+          </w:p>
+        </w:tc>
+        <w:tc>
+          <w:tcPr>
+            <w:tcW w:w="1701" w:type="dxa"/>
+            <w:tcBorders>
+              <w:top w:val="single" w:sz="4" w:space="0" w:color="auto"/>
+              <w:left w:val="single" w:sz="4" w:space="0" w:color="auto"/>
+              <w:bottom w:val="single" w:sz="4" w:space="0" w:color="auto"/>
+              <w:right w:val="single" w:sz="4" w:space="0" w:color="auto"/>
+            </w:tcBorders>
+            <w:vAlign w:val="center"/>
+            <w:hideMark/>
+          </w:tcPr>
+          <w:p>
+            <w:proofErr w:type="spellStart"/>
+            <w:r>
+              <w:t>MariaDB</w:t>
+            </w:r>
+            <w:proofErr w:type="spellEnd"/>
+          </w:p>
+        </w:tc>
+        <w:tc>
+          <w:tcPr>
+            <w:tcW w:w="2835" w:type="dxa"/>
+            <w:tcBorders>
+              <w:top w:val="single" w:sz="4" w:space="0" w:color="auto"/>
+              <w:left w:val="single" w:sz="4" w:space="0" w:color="auto"/>
+              <w:bottom w:val="single" w:sz="4" w:space="0" w:color="auto"/>
+              <w:right w:val="single" w:sz="4" w:space="0" w:color="auto"/>
+            </w:tcBorders>
+            <w:vAlign w:val="center"/>
+            <w:hideMark/>
+          </w:tcPr>
+          <w:p>
+            <w:r>
+              <w:t>Uživatelé a domény</w:t>
+            </w:r>
+          </w:p>
+        </w:tc>
+        <w:tc>
+          <w:tcPr>
+            <w:tcW w:w="2268" w:type="dxa"/>
+            <w:tcBorders>
+              <w:top w:val="single" w:sz="4" w:space="0" w:color="auto"/>
+              <w:left w:val="single" w:sz="4" w:space="0" w:color="auto"/>
+              <w:bottom w:val="single" w:sz="4" w:space="0" w:color="auto"/>
+              <w:right w:val="single" w:sz="4" w:space="0" w:color="auto"/>
+            </w:tcBorders>
+            <w:vAlign w:val="center"/>
+            <w:hideMark/>
+          </w:tcPr>
+          <w:p>
+            <w:r>
+              <w:t>Přístup přes PDO</w:t>
+            </w:r>
+          </w:p>
+        </w:tc>
+      </w:tr>
+      <w:tr>
+        <w:trPr>
+          <w:jc w:val="center"/>
+        </w:trPr>
+        <w:tc>
+          <w:tcPr>
+            <w:tcW w:w="1701" w:type="dxa"/>
+            <w:tcBorders>
+              <w:top w:val="single" w:sz="4" w:space="0" w:color="auto"/>
+              <w:left w:val="single" w:sz="4" w:space="0" w:color="auto"/>
+              <w:bottom w:val="single" w:sz="4" w:space="0" w:color="auto"/>
+              <w:right w:val="single" w:sz="4" w:space="0" w:color="auto"/>
+            </w:tcBorders>
+            <w:vAlign w:val="center"/>
+            <w:hideMark/>
+          </w:tcPr>
+          <w:p>
+            <w:r>
+              <w:t>Nasazení</w:t>
+            </w:r>
+          </w:p>
+        </w:tc>
+        <w:tc>
+          <w:tcPr>
+            <w:tcW w:w="1701" w:type="dxa"/>
+            <w:tcBorders>
+              <w:top w:val="single" w:sz="4" w:space="0" w:color="auto"/>
+              <w:left w:val="single" w:sz="4" w:space="0" w:color="auto"/>
+              <w:bottom w:val="single" w:sz="4" w:space="0" w:color="auto"/>
+              <w:right w:val="single" w:sz="4" w:space="0" w:color="auto"/>
+            </w:tcBorders>
+            <w:vAlign w:val="center"/>
+            <w:hideMark/>
+          </w:tcPr>
+          <w:p>
+            <w:proofErr w:type="spellStart"/>
+            <w:r>
+              <w:t>Docker</w:t>
+            </w:r>
+            <w:proofErr w:type="spellEnd"/>
+            <w:r>
+              <w:t xml:space="preserve"> </w:t>
+            </w:r>
+            <w:proofErr w:type="spellStart"/>
+            <w:r>
+              <w:t>Compose</w:t>
+            </w:r>
+            <w:proofErr w:type="spellEnd"/>
+          </w:p>
+        </w:tc>
+        <w:tc>
+          <w:tcPr>
+            <w:tcW w:w="2835" w:type="dxa"/>
+            <w:tcBorders>
+              <w:top w:val="single" w:sz="4" w:space="0" w:color="auto"/>
+              <w:left w:val="single" w:sz="4" w:space="0" w:color="auto"/>
+              <w:bottom w:val="single" w:sz="4" w:space="0" w:color="auto"/>
+              <w:right w:val="single" w:sz="4" w:space="0" w:color="auto"/>
+            </w:tcBorders>
+            <w:vAlign w:val="center"/>
+            <w:hideMark/>
+          </w:tcPr>
+          <w:p>
+            <w:r>
+              <w:t>Web + DB + FTP</w:t>
+            </w:r>
+          </w:p>
+        </w:tc>
+        <w:tc>
+          <w:tcPr>
+            <w:tcW w:w="2268" w:type="dxa"/>
+            <w:tcBorders>
+              <w:top w:val="single" w:sz="4" w:space="0" w:color="auto"/>
+              <w:left w:val="single" w:sz="4" w:space="0" w:color="auto"/>
+              <w:bottom w:val="single" w:sz="4" w:space="0" w:color="auto"/>
+              <w:right w:val="single" w:sz="4" w:space="0" w:color="auto"/>
+            </w:tcBorders>
+            <w:vAlign w:val="center"/>
+            <w:hideMark/>
+          </w:tcPr>
+          <w:p>
+            <w:r>
+              <w:t>APP přímo využívá službu web</w:t>
+            </w:r>
+          </w:p>
+        </w:tc>
+      </w:tr>
+    </w:tbl>
+    <w:p>
+      <w:pPr>
+        <w:pStyle w:val="Nadpis2"/>
+      </w:pPr>
+      <w:bookmarkStart w:id="22" w:name="_Toc227005805"/>
+      <w:r>
+        <w:t>5.</w:t>
+      </w:r>
+      <w:r>
+        <w:t xml:space="preserve">3. Struktura adresáře </w:t>
+      </w:r>
+      <w:proofErr w:type="spellStart"/>
+      <w:r>
+        <w:t>app</w:t>
+      </w:r>
+      <w:bookmarkEnd w:id="22"/>
+      <w:proofErr w:type="spellEnd"/>
+    </w:p>
+    <w:p>
+      <w:r>
+        <w:t>Obsah:</w:t>
+      </w:r>
+    </w:p>
+    <w:tbl>
+      <w:tblPr>
+        <w:tblStyle w:val="Mkatabulky"/>
+        <w:tblW w:w="0" w:type="auto"/>
+        <w:jc w:val="center"/>
+        <w:tblLook w:val="04A0" w:firstRow="1" w:lastRow="0" w:firstColumn="1" w:lastColumn="0" w:noHBand="0" w:noVBand="1"/>
+      </w:tblPr>
+      <w:tblGrid>
+        <w:gridCol w:w="2608"/>
+        <w:gridCol w:w="1329"/>
+        <w:gridCol w:w="5216"/>
+      </w:tblGrid>
+      <w:tr>
+        <w:trPr>
+          <w:jc w:val="center"/>
+        </w:trPr>
+        <w:tc>
+          <w:tcPr>
+            <w:tcW w:w="2608" w:type="dxa"/>
+            <w:tcBorders>
+              <w:top w:val="single" w:sz="4" w:space="0" w:color="auto"/>
+              <w:left w:val="single" w:sz="4" w:space="0" w:color="auto"/>
+              <w:bottom w:val="single" w:sz="4" w:space="0" w:color="auto"/>
+              <w:right w:val="single" w:sz="4" w:space="0" w:color="auto"/>
+            </w:tcBorders>
+            <w:shd w:val="clear" w:color="auto" w:fill="1F4E79"/>
+            <w:vAlign w:val="center"/>
+            <w:hideMark/>
+          </w:tcPr>
+          <w:p>
+            <w:r>
+              <w:rPr>
+                <w:b/>
+              </w:rPr>
+              <w:t>Soubor</w:t>
+            </w:r>
+          </w:p>
+        </w:tc>
+        <w:tc>
+          <w:tcPr>
+            <w:tcW w:w="1247" w:type="dxa"/>
+            <w:tcBorders>
+              <w:top w:val="single" w:sz="4" w:space="0" w:color="auto"/>
+              <w:left w:val="single" w:sz="4" w:space="0" w:color="auto"/>
+              <w:bottom w:val="single" w:sz="4" w:space="0" w:color="auto"/>
+              <w:right w:val="single" w:sz="4" w:space="0" w:color="auto"/>
+            </w:tcBorders>
+            <w:shd w:val="clear" w:color="auto" w:fill="1F4E79"/>
+            <w:vAlign w:val="center"/>
+            <w:hideMark/>
+          </w:tcPr>
+          <w:p>
+            <w:r>
+              <w:rPr>
+                <w:b/>
+              </w:rPr>
+              <w:t>Typ</w:t>
+            </w:r>
+          </w:p>
+        </w:tc>
+        <w:tc>
+          <w:tcPr>
+            <w:tcW w:w="5216" w:type="dxa"/>
+            <w:tcBorders>
+              <w:top w:val="single" w:sz="4" w:space="0" w:color="auto"/>
+              <w:left w:val="single" w:sz="4" w:space="0" w:color="auto"/>
+              <w:bottom w:val="single" w:sz="4" w:space="0" w:color="auto"/>
+              <w:right w:val="single" w:sz="4" w:space="0" w:color="auto"/>
+            </w:tcBorders>
+            <w:shd w:val="clear" w:color="auto" w:fill="1F4E79"/>
+            <w:vAlign w:val="center"/>
+            <w:hideMark/>
+          </w:tcPr>
+          <w:p>
+            <w:r>
+              <w:rPr>
+                <w:b/>
+              </w:rPr>
+              <w:t>Popis</w:t>
+            </w:r>
+          </w:p>
+        </w:tc>
+      </w:tr>
+      <w:tr>
+        <w:trPr>
+          <w:jc w:val="center"/>
+        </w:trPr>
+        <w:tc>
+          <w:tcPr>
+            <w:tcW w:w="2608" w:type="dxa"/>
+            <w:tcBorders>
+              <w:top w:val="single" w:sz="4" w:space="0" w:color="auto"/>
+              <w:left w:val="single" w:sz="4" w:space="0" w:color="auto"/>
+              <w:bottom w:val="single" w:sz="4" w:space="0" w:color="auto"/>
+              <w:right w:val="single" w:sz="4" w:space="0" w:color="auto"/>
+            </w:tcBorders>
+            <w:vAlign w:val="center"/>
+            <w:hideMark/>
+          </w:tcPr>
+          <w:p>
+            <w:proofErr w:type="spellStart"/>
+            <w:r>
+              <w:t>app</w:t>
+            </w:r>
+            <w:proofErr w:type="spellEnd"/>
+            <w:r>
+              <w:t>/</w:t>
+            </w:r>
+            <w:proofErr w:type="spellStart"/>
+            <w:r>
+              <w:t>Dockerfile</w:t>
+            </w:r>
+            <w:proofErr w:type="spellEnd"/>
+          </w:p>
+        </w:tc>
+        <w:tc>
+          <w:tcPr>
+            <w:tcW w:w="1247" w:type="dxa"/>
+            <w:tcBorders>
+              <w:top w:val="single" w:sz="4" w:space="0" w:color="auto"/>
+              <w:left w:val="single" w:sz="4" w:space="0" w:color="auto"/>
+              <w:bottom w:val="single" w:sz="4" w:space="0" w:color="auto"/>
+              <w:right w:val="single" w:sz="4" w:space="0" w:color="auto"/>
+            </w:tcBorders>
+            <w:vAlign w:val="center"/>
+            <w:hideMark/>
+          </w:tcPr>
+          <w:p>
+            <w:proofErr w:type="spellStart"/>
+            <w:r>
+              <w:t>Docker</w:t>
+            </w:r>
+            <w:proofErr w:type="spellEnd"/>
+          </w:p>
+        </w:tc>
+        <w:tc>
+          <w:tcPr>
+            <w:tcW w:w="5216" w:type="dxa"/>
+            <w:tcBorders>
+              <w:top w:val="single" w:sz="4" w:space="0" w:color="auto"/>
+              <w:left w:val="single" w:sz="4" w:space="0" w:color="auto"/>
+              <w:bottom w:val="single" w:sz="4" w:space="0" w:color="auto"/>
+              <w:right w:val="single" w:sz="4" w:space="0" w:color="auto"/>
+            </w:tcBorders>
+            <w:vAlign w:val="center"/>
+            <w:hideMark/>
+          </w:tcPr>
+          <w:p>
+            <w:r>
+              <w:t xml:space="preserve">Instaluje </w:t>
+            </w:r>
+            <w:proofErr w:type="spellStart"/>
+            <w:r>
+              <w:t>pdo</w:t>
+            </w:r>
+            <w:proofErr w:type="spellEnd"/>
+            <w:r>
+              <w:t xml:space="preserve">, </w:t>
+            </w:r>
+            <w:proofErr w:type="spellStart"/>
+            <w:r>
+              <w:t>pdo_mysql</w:t>
+            </w:r>
+            <w:proofErr w:type="spellEnd"/>
+            <w:r>
+              <w:t xml:space="preserve">, </w:t>
+            </w:r>
+            <w:proofErr w:type="spellStart"/>
+            <w:r>
+              <w:t>mysqli</w:t>
+            </w:r>
+            <w:proofErr w:type="spellEnd"/>
+            <w:r>
+              <w:t xml:space="preserve"> a povolí </w:t>
+            </w:r>
+            <w:proofErr w:type="spellStart"/>
+            <w:r>
+              <w:t>Apache</w:t>
+            </w:r>
+            <w:proofErr w:type="spellEnd"/>
+            <w:r>
+              <w:t xml:space="preserve"> </w:t>
+            </w:r>
+            <w:proofErr w:type="spellStart"/>
+            <w:r>
+              <w:t>mod_rewrite</w:t>
+            </w:r>
+            <w:proofErr w:type="spellEnd"/>
+            <w:r>
+              <w:t>.</w:t>
+            </w:r>
+          </w:p>
+        </w:tc>
+      </w:tr>
+      <w:tr>
+        <w:trPr>
+          <w:jc w:val="center"/>
+        </w:trPr>
+        <w:tc>
+          <w:tcPr>
+            <w:tcW w:w="2608" w:type="dxa"/>
+            <w:tcBorders>
+              <w:top w:val="single" w:sz="4" w:space="0" w:color="auto"/>
+              <w:left w:val="single" w:sz="4" w:space="0" w:color="auto"/>
+              <w:bottom w:val="single" w:sz="4" w:space="0" w:color="auto"/>
+              <w:right w:val="single" w:sz="4" w:space="0" w:color="auto"/>
+            </w:tcBorders>
+            <w:vAlign w:val="center"/>
+            <w:hideMark/>
+          </w:tcPr>
+          <w:p>
+            <w:proofErr w:type="spellStart"/>
+            <w:r>
+              <w:t>app</w:t>
+            </w:r>
+            <w:proofErr w:type="spellEnd"/>
+            <w:r>
+              <w:t>/</w:t>
+            </w:r>
+            <w:proofErr w:type="spellStart"/>
+            <w:r>
+              <w:t>src</w:t>
+            </w:r>
+            <w:proofErr w:type="spellEnd"/>
+            <w:r>
+              <w:t>/</w:t>
+            </w:r>
+            <w:proofErr w:type="spellStart"/>
+            <w:r>
+              <w:t>index.php</w:t>
+            </w:r>
+            <w:proofErr w:type="spellEnd"/>
+          </w:p>
+        </w:tc>
+        <w:tc>
+          <w:tcPr>
+            <w:tcW w:w="1247" w:type="dxa"/>
+            <w:tcBorders>
+              <w:top w:val="single" w:sz="4" w:space="0" w:color="auto"/>
+              <w:left w:val="single" w:sz="4" w:space="0" w:color="auto"/>
+              <w:bottom w:val="single" w:sz="4" w:space="0" w:color="auto"/>
+              <w:right w:val="single" w:sz="4" w:space="0" w:color="auto"/>
+            </w:tcBorders>
+            <w:vAlign w:val="center"/>
+            <w:hideMark/>
+          </w:tcPr>
+          <w:p>
+            <w:r>
+              <w:t>PHP/HTML</w:t>
+            </w:r>
+          </w:p>
+        </w:tc>
+        <w:tc>
+          <w:tcPr>
+            <w:tcW w:w="5216" w:type="dxa"/>
+            <w:tcBorders>
+              <w:top w:val="single" w:sz="4" w:space="0" w:color="auto"/>
+              <w:left w:val="single" w:sz="4" w:space="0" w:color="auto"/>
+              <w:bottom w:val="single" w:sz="4" w:space="0" w:color="auto"/>
+              <w:right w:val="single" w:sz="4" w:space="0" w:color="auto"/>
+            </w:tcBorders>
+            <w:vAlign w:val="center"/>
+            <w:hideMark/>
+          </w:tcPr>
+          <w:p>
+            <w:r>
+              <w:t>Úvodní stránka s odkazy na registraci a přihlášení.</w:t>
+            </w:r>
+          </w:p>
+        </w:tc>
+      </w:tr>
+      <w:tr>
+        <w:trPr>
+          <w:jc w:val="center"/>
+        </w:trPr>
+        <w:tc>
+          <w:tcPr>
+            <w:tcW w:w="2608" w:type="dxa"/>
+            <w:tcBorders>
+              <w:top w:val="single" w:sz="4" w:space="0" w:color="auto"/>
+              <w:left w:val="single" w:sz="4" w:space="0" w:color="auto"/>
+              <w:bottom w:val="single" w:sz="4" w:space="0" w:color="auto"/>
+              <w:right w:val="single" w:sz="4" w:space="0" w:color="auto"/>
+            </w:tcBorders>
+            <w:vAlign w:val="center"/>
+            <w:hideMark/>
+          </w:tcPr>
+          <w:p>
+            <w:proofErr w:type="spellStart"/>
+            <w:r>
+              <w:t>app</w:t>
+            </w:r>
+            <w:proofErr w:type="spellEnd"/>
+            <w:r>
+              <w:t>/</w:t>
+            </w:r>
+            <w:proofErr w:type="spellStart"/>
+            <w:r>
+              <w:t>src</w:t>
+            </w:r>
+            <w:proofErr w:type="spellEnd"/>
+            <w:r>
+              <w:t>/</w:t>
+            </w:r>
+            <w:proofErr w:type="spellStart"/>
+            <w:r>
+              <w:t>register.php</w:t>
+            </w:r>
+            <w:proofErr w:type="spellEnd"/>
+          </w:p>
+        </w:tc>
+        <w:tc>
+          <w:tcPr>
+            <w:tcW w:w="1247" w:type="dxa"/>
+            <w:tcBorders>
+              <w:top w:val="single" w:sz="4" w:space="0" w:color="auto"/>
+              <w:left w:val="single" w:sz="4" w:space="0" w:color="auto"/>
+              <w:bottom w:val="single" w:sz="4" w:space="0" w:color="auto"/>
+              <w:right w:val="single" w:sz="4" w:space="0" w:color="auto"/>
+            </w:tcBorders>
+            <w:vAlign w:val="center"/>
+            <w:hideMark/>
+          </w:tcPr>
+          <w:p>
+            <w:r>
+              <w:t>PHP</w:t>
+            </w:r>
+          </w:p>
+        </w:tc>
+        <w:tc>
+          <w:tcPr>
+            <w:tcW w:w="5216" w:type="dxa"/>
+            <w:tcBorders>
+              <w:top w:val="single" w:sz="4" w:space="0" w:color="auto"/>
+              <w:left w:val="single" w:sz="4" w:space="0" w:color="auto"/>
+              <w:bottom w:val="single" w:sz="4" w:space="0" w:color="auto"/>
+              <w:right w:val="single" w:sz="4" w:space="0" w:color="auto"/>
+            </w:tcBorders>
+            <w:vAlign w:val="center"/>
+            <w:hideMark/>
+          </w:tcPr>
+          <w:p>
+            <w:r>
+              <w:t xml:space="preserve">Vytváří nový účet a ukládá </w:t>
+            </w:r>
+            <w:proofErr w:type="spellStart"/>
+            <w:r>
+              <w:t>hash</w:t>
+            </w:r>
+            <w:proofErr w:type="spellEnd"/>
+            <w:r>
+              <w:t xml:space="preserve"> hesla.</w:t>
+            </w:r>
+          </w:p>
+        </w:tc>
+      </w:tr>
+      <w:tr>
+        <w:trPr>
+          <w:jc w:val="center"/>
+        </w:trPr>
+        <w:tc>
+          <w:tcPr>
+            <w:tcW w:w="2608" w:type="dxa"/>
+            <w:tcBorders>
+              <w:top w:val="single" w:sz="4" w:space="0" w:color="auto"/>
+              <w:left w:val="single" w:sz="4" w:space="0" w:color="auto"/>
+              <w:bottom w:val="single" w:sz="4" w:space="0" w:color="auto"/>
+              <w:right w:val="single" w:sz="4" w:space="0" w:color="auto"/>
+            </w:tcBorders>
+            <w:vAlign w:val="center"/>
+            <w:hideMark/>
+          </w:tcPr>
+          <w:p>
+            <w:proofErr w:type="spellStart"/>
+            <w:r>
+              <w:t>app</w:t>
+            </w:r>
+            <w:proofErr w:type="spellEnd"/>
+            <w:r>
+              <w:t>/</w:t>
+            </w:r>
+            <w:proofErr w:type="spellStart"/>
+            <w:r>
+              <w:t>src</w:t>
+            </w:r>
+            <w:proofErr w:type="spellEnd"/>
+            <w:r>
+              <w:t>/</w:t>
+            </w:r>
+            <w:proofErr w:type="spellStart"/>
+            <w:r>
+              <w:t>login.php</w:t>
+            </w:r>
+            <w:proofErr w:type="spellEnd"/>
+          </w:p>
+        </w:tc>
+        <w:tc>
+          <w:tcPr>
+            <w:tcW w:w="1247" w:type="dxa"/>
+            <w:tcBorders>
+              <w:top w:val="single" w:sz="4" w:space="0" w:color="auto"/>
+              <w:left w:val="single" w:sz="4" w:space="0" w:color="auto"/>
+              <w:bottom w:val="single" w:sz="4" w:space="0" w:color="auto"/>
+              <w:right w:val="single" w:sz="4" w:space="0" w:color="auto"/>
+            </w:tcBorders>
+            <w:vAlign w:val="center"/>
+            <w:hideMark/>
+          </w:tcPr>
+          <w:p>
+            <w:r>
+              <w:t>PHP</w:t>
+            </w:r>
+          </w:p>
+        </w:tc>
+        <w:tc>
+          <w:tcPr>
+            <w:tcW w:w="5216" w:type="dxa"/>
+            <w:tcBorders>
+              <w:top w:val="single" w:sz="4" w:space="0" w:color="auto"/>
+              <w:left w:val="single" w:sz="4" w:space="0" w:color="auto"/>
+              <w:bottom w:val="single" w:sz="4" w:space="0" w:color="auto"/>
+              <w:right w:val="single" w:sz="4" w:space="0" w:color="auto"/>
+            </w:tcBorders>
+            <w:vAlign w:val="center"/>
+            <w:hideMark/>
+          </w:tcPr>
+          <w:p>
+            <w:r>
+              <w:t>Načítá uživatele podle jména a ověřuje heslo.</w:t>
+            </w:r>
+          </w:p>
+        </w:tc>
+      </w:tr>
+      <w:tr>
+        <w:trPr>
+          <w:jc w:val="center"/>
+        </w:trPr>
+        <w:tc>
+          <w:tcPr>
+            <w:tcW w:w="2608" w:type="dxa"/>
+            <w:tcBorders>
+              <w:top w:val="single" w:sz="4" w:space="0" w:color="auto"/>
+              <w:left w:val="single" w:sz="4" w:space="0" w:color="auto"/>
+              <w:bottom w:val="single" w:sz="4" w:space="0" w:color="auto"/>
+              <w:right w:val="single" w:sz="4" w:space="0" w:color="auto"/>
+            </w:tcBorders>
+            <w:vAlign w:val="center"/>
+            <w:hideMark/>
+          </w:tcPr>
+          <w:p>
+            <w:proofErr w:type="spellStart"/>
+            <w:r>
+              <w:t>app</w:t>
+            </w:r>
+            <w:proofErr w:type="spellEnd"/>
+            <w:r>
+              <w:t>/</w:t>
+            </w:r>
+            <w:proofErr w:type="spellStart"/>
+            <w:r>
+              <w:t>src</w:t>
+            </w:r>
+            <w:proofErr w:type="spellEnd"/>
+            <w:r>
+              <w:t>/</w:t>
+            </w:r>
+            <w:proofErr w:type="spellStart"/>
+            <w:r>
+              <w:t>dashboard.php</w:t>
+            </w:r>
+            <w:proofErr w:type="spellEnd"/>
+          </w:p>
+        </w:tc>
+        <w:tc>
+          <w:tcPr>
+            <w:tcW w:w="1247" w:type="dxa"/>
+            <w:tcBorders>
+              <w:top w:val="single" w:sz="4" w:space="0" w:color="auto"/>
+              <w:left w:val="single" w:sz="4" w:space="0" w:color="auto"/>
+              <w:bottom w:val="single" w:sz="4" w:space="0" w:color="auto"/>
+              <w:right w:val="single" w:sz="4" w:space="0" w:color="auto"/>
+            </w:tcBorders>
+            <w:vAlign w:val="center"/>
+            <w:hideMark/>
+          </w:tcPr>
+          <w:p>
+            <w:r>
+              <w:t>PHP</w:t>
+            </w:r>
+          </w:p>
+        </w:tc>
+        <w:tc>
+          <w:tcPr>
+            <w:tcW w:w="5216" w:type="dxa"/>
+            <w:tcBorders>
+              <w:top w:val="single" w:sz="4" w:space="0" w:color="auto"/>
+              <w:left w:val="single" w:sz="4" w:space="0" w:color="auto"/>
+              <w:bottom w:val="single" w:sz="4" w:space="0" w:color="auto"/>
+              <w:right w:val="single" w:sz="4" w:space="0" w:color="auto"/>
+            </w:tcBorders>
+            <w:vAlign w:val="center"/>
+            <w:hideMark/>
+          </w:tcPr>
+          <w:p>
+            <w:r>
+              <w:t>Stránka po přihlášení; zobrazuje profil a doménu.</w:t>
+            </w:r>
+          </w:p>
+        </w:tc>
+      </w:tr>
+      <w:tr>
+        <w:trPr>
+          <w:jc w:val="center"/>
+        </w:trPr>
+        <w:tc>
+          <w:tcPr>
+            <w:tcW w:w="2608" w:type="dxa"/>
+            <w:tcBorders>
+              <w:top w:val="single" w:sz="4" w:space="0" w:color="auto"/>
+              <w:left w:val="single" w:sz="4" w:space="0" w:color="auto"/>
+              <w:bottom w:val="single" w:sz="4" w:space="0" w:color="auto"/>
+              <w:right w:val="single" w:sz="4" w:space="0" w:color="auto"/>
+            </w:tcBorders>
+            <w:vAlign w:val="center"/>
+            <w:hideMark/>
+          </w:tcPr>
+          <w:p>
+            <w:proofErr w:type="spellStart"/>
+            <w:r>
+              <w:t>app</w:t>
+            </w:r>
+            <w:proofErr w:type="spellEnd"/>
+            <w:r>
+              <w:t>/</w:t>
+            </w:r>
+            <w:proofErr w:type="spellStart"/>
+            <w:r>
+              <w:t>src</w:t>
+            </w:r>
+            <w:proofErr w:type="spellEnd"/>
+            <w:r>
+              <w:t>/</w:t>
+            </w:r>
+            <w:proofErr w:type="spellStart"/>
+            <w:r>
+              <w:t>logout.php</w:t>
+            </w:r>
+            <w:proofErr w:type="spellEnd"/>
+          </w:p>
+        </w:tc>
+        <w:tc>
+          <w:tcPr>
+            <w:tcW w:w="1247" w:type="dxa"/>
+            <w:tcBorders>
+              <w:top w:val="single" w:sz="4" w:space="0" w:color="auto"/>
+              <w:left w:val="single" w:sz="4" w:space="0" w:color="auto"/>
+              <w:bottom w:val="single" w:sz="4" w:space="0" w:color="auto"/>
+              <w:right w:val="single" w:sz="4" w:space="0" w:color="auto"/>
+            </w:tcBorders>
+            <w:vAlign w:val="center"/>
+            <w:hideMark/>
+          </w:tcPr>
+          <w:p>
+            <w:r>
+              <w:t>PHP</w:t>
+            </w:r>
+          </w:p>
+        </w:tc>
+        <w:tc>
+          <w:tcPr>
+            <w:tcW w:w="5216" w:type="dxa"/>
+            <w:tcBorders>
+              <w:top w:val="single" w:sz="4" w:space="0" w:color="auto"/>
+              <w:left w:val="single" w:sz="4" w:space="0" w:color="auto"/>
+              <w:bottom w:val="single" w:sz="4" w:space="0" w:color="auto"/>
+              <w:right w:val="single" w:sz="4" w:space="0" w:color="auto"/>
+            </w:tcBorders>
+            <w:vAlign w:val="center"/>
+            <w:hideMark/>
+          </w:tcPr>
+          <w:p>
+            <w:r>
+              <w:t>Ukončí session a přesměruje na login.</w:t>
+            </w:r>
+          </w:p>
+        </w:tc>
+      </w:tr>
+      <w:tr>
+        <w:trPr>
+          <w:jc w:val="center"/>
+        </w:trPr>
+        <w:tc>
+          <w:tcPr>
+            <w:tcW w:w="2608" w:type="dxa"/>
+            <w:tcBorders>
+              <w:top w:val="single" w:sz="4" w:space="0" w:color="auto"/>
+              <w:left w:val="single" w:sz="4" w:space="0" w:color="auto"/>
+              <w:bottom w:val="single" w:sz="4" w:space="0" w:color="auto"/>
+              <w:right w:val="single" w:sz="4" w:space="0" w:color="auto"/>
+            </w:tcBorders>
+            <w:vAlign w:val="center"/>
+            <w:hideMark/>
+          </w:tcPr>
+          <w:p>
+            <w:proofErr w:type="spellStart"/>
+            <w:r>
+              <w:t>app</w:t>
+            </w:r>
+            <w:proofErr w:type="spellEnd"/>
+            <w:r>
+              <w:t>/</w:t>
+            </w:r>
+            <w:proofErr w:type="spellStart"/>
+            <w:r>
+              <w:t>src</w:t>
+            </w:r>
+            <w:proofErr w:type="spellEnd"/>
+            <w:r>
+              <w:t>/</w:t>
+            </w:r>
+            <w:proofErr w:type="spellStart"/>
+            <w:r>
+              <w:t>db.php</w:t>
+            </w:r>
+            <w:proofErr w:type="spellEnd"/>
+          </w:p>
+        </w:tc>
+        <w:tc>
+          <w:tcPr>
+            <w:tcW w:w="1247" w:type="dxa"/>
+            <w:tcBorders>
+              <w:top w:val="single" w:sz="4" w:space="0" w:color="auto"/>
+              <w:left w:val="single" w:sz="4" w:space="0" w:color="auto"/>
+              <w:bottom w:val="single" w:sz="4" w:space="0" w:color="auto"/>
+              <w:right w:val="single" w:sz="4" w:space="0" w:color="auto"/>
+            </w:tcBorders>
+            <w:vAlign w:val="center"/>
+            <w:hideMark/>
+          </w:tcPr>
+          <w:p>
+            <w:r>
+              <w:t>PHP</w:t>
+            </w:r>
+          </w:p>
+        </w:tc>
+        <w:tc>
+          <w:tcPr>
+            <w:tcW w:w="5216" w:type="dxa"/>
+            <w:tcBorders>
+              <w:top w:val="single" w:sz="4" w:space="0" w:color="auto"/>
+              <w:left w:val="single" w:sz="4" w:space="0" w:color="auto"/>
+              <w:bottom w:val="single" w:sz="4" w:space="0" w:color="auto"/>
+              <w:right w:val="single" w:sz="4" w:space="0" w:color="auto"/>
+            </w:tcBorders>
+            <w:vAlign w:val="center"/>
+            <w:hideMark/>
+          </w:tcPr>
+          <w:p>
+            <w:r>
+              <w:t xml:space="preserve">Centralizované připojení k </w:t>
+            </w:r>
+            <w:proofErr w:type="spellStart"/>
+            <w:r>
+              <w:t>MariaDB</w:t>
+            </w:r>
+            <w:proofErr w:type="spellEnd"/>
+            <w:r>
+              <w:t xml:space="preserve"> přes PDO.</w:t>
+            </w:r>
+          </w:p>
+        </w:tc>
+      </w:tr>
+      <w:tr>
+        <w:trPr>
+          <w:jc w:val="center"/>
+        </w:trPr>
+        <w:tc>
+          <w:tcPr>
+            <w:tcW w:w="2608" w:type="dxa"/>
+            <w:tcBorders>
+              <w:top w:val="single" w:sz="4" w:space="0" w:color="auto"/>
+              <w:left w:val="single" w:sz="4" w:space="0" w:color="auto"/>
+              <w:bottom w:val="single" w:sz="4" w:space="0" w:color="auto"/>
+              <w:right w:val="single" w:sz="4" w:space="0" w:color="auto"/>
+            </w:tcBorders>
+            <w:vAlign w:val="center"/>
+            <w:hideMark/>
+          </w:tcPr>
+          <w:p>
+            <w:proofErr w:type="spellStart"/>
+            <w:r>
+              <w:t>app</w:t>
+            </w:r>
+            <w:proofErr w:type="spellEnd"/>
+            <w:r>
+              <w:t>/</w:t>
+            </w:r>
+            <w:proofErr w:type="spellStart"/>
+            <w:r>
+              <w:t>src</w:t>
+            </w:r>
+            <w:proofErr w:type="spellEnd"/>
+            <w:r>
+              <w:t>/style.css</w:t>
+            </w:r>
+          </w:p>
+        </w:tc>
+        <w:tc>
+          <w:tcPr>
+            <w:tcW w:w="1247" w:type="dxa"/>
+            <w:tcBorders>
+              <w:top w:val="single" w:sz="4" w:space="0" w:color="auto"/>
+              <w:left w:val="single" w:sz="4" w:space="0" w:color="auto"/>
+              <w:bottom w:val="single" w:sz="4" w:space="0" w:color="auto"/>
+              <w:right w:val="single" w:sz="4" w:space="0" w:color="auto"/>
+            </w:tcBorders>
+            <w:vAlign w:val="center"/>
+            <w:hideMark/>
+          </w:tcPr>
+          <w:p>
+            <w:r>
+              <w:t>CSS</w:t>
+            </w:r>
+          </w:p>
+        </w:tc>
+        <w:tc>
+          <w:tcPr>
+            <w:tcW w:w="5216" w:type="dxa"/>
+            <w:tcBorders>
+              <w:top w:val="single" w:sz="4" w:space="0" w:color="auto"/>
+              <w:left w:val="single" w:sz="4" w:space="0" w:color="auto"/>
+              <w:bottom w:val="single" w:sz="4" w:space="0" w:color="auto"/>
+              <w:right w:val="single" w:sz="4" w:space="0" w:color="auto"/>
+            </w:tcBorders>
+            <w:vAlign w:val="center"/>
+            <w:hideMark/>
+          </w:tcPr>
+          <w:p>
+            <w:r>
+              <w:t>Společný vzhled všech stránek aplikace.</w:t>
+            </w:r>
+          </w:p>
+        </w:tc>
+      </w:tr>
+    </w:tbl>
+    <w:p>
+      <w:pPr>
+        <w:pStyle w:val="Nadpis2"/>
+      </w:pPr>
+      <w:bookmarkStart w:id="23" w:name="_Toc227005806"/>
+      <w:r>
+        <w:t>5.</w:t>
+      </w:r>
+      <w:r>
+        <w:t>4. Uživatelský tok aplikace</w:t>
+      </w:r>
+      <w:bookmarkEnd w:id="23"/>
+    </w:p>
+    <w:p>
+      <w:r>
+        <w:t xml:space="preserve">Průchod aplikací je lineární. Uživatel přichází na </w:t>
+      </w:r>
+      <w:proofErr w:type="spellStart"/>
+      <w:r>
+        <w:t>index.php</w:t>
+      </w:r>
+      <w:proofErr w:type="spellEnd"/>
+      <w:r>
+        <w:t xml:space="preserve">, odkud může přejít na registraci nebo přihlášení. Po úspěšném přihlášení je přesměrován na </w:t>
+      </w:r>
+      <w:proofErr w:type="spellStart"/>
+      <w:r>
+        <w:t>dashboard.php</w:t>
+      </w:r>
+      <w:proofErr w:type="spellEnd"/>
+      <w:r>
+        <w:t>. Nepřihlášený uživatel se na dashboard nedostane, protože stránka kontroluje existenci hodnoty $_SESSION['user'].</w:t>
+      </w:r>
+    </w:p>
     <w:p/>
+    <w:p>
+      <w:pPr>
+        <w:rPr>
+          <w:b/>
+          <w:bCs/>
+        </w:rPr>
+      </w:pPr>
+      <w:r>
+        <w:rPr>
+          <w:b/>
+          <w:bCs/>
+        </w:rPr>
+        <w:t>Scénář registrace</w:t>
+      </w:r>
+    </w:p>
+    <w:p>
+      <w:r>
+        <w:t xml:space="preserve">• uživatel vyplní </w:t>
+      </w:r>
+      <w:proofErr w:type="spellStart"/>
+      <w:r>
+        <w:t>username</w:t>
+      </w:r>
+      <w:proofErr w:type="spellEnd"/>
+      <w:r>
+        <w:t>, e-mail a heslo;</w:t>
+      </w:r>
+    </w:p>
+    <w:p>
+      <w:r>
+        <w:t>• skript zkontroluje, zda stejné jméno nebo e-mail už v databázi neexistují;</w:t>
+      </w:r>
+    </w:p>
+    <w:p>
+      <w:r>
+        <w:t xml:space="preserve">• heslo se uloží jako </w:t>
+      </w:r>
+      <w:proofErr w:type="spellStart"/>
+      <w:r>
+        <w:t>hash</w:t>
+      </w:r>
+      <w:proofErr w:type="spellEnd"/>
+      <w:r>
+        <w:t xml:space="preserve"> pomocí </w:t>
+      </w:r>
+      <w:proofErr w:type="spellStart"/>
+      <w:r>
+        <w:t>password_hash</w:t>
+      </w:r>
+      <w:proofErr w:type="spellEnd"/>
+      <w:r>
+        <w:t>();</w:t>
+      </w:r>
+    </w:p>
+    <w:p>
+      <w:r>
+        <w:t xml:space="preserve">• nový záznam se vloží do tabulky </w:t>
+      </w:r>
+      <w:proofErr w:type="spellStart"/>
+      <w:r>
+        <w:t>uzivatele</w:t>
+      </w:r>
+      <w:proofErr w:type="spellEnd"/>
+      <w:r>
+        <w:t>;</w:t>
+      </w:r>
+    </w:p>
+    <w:p>
+      <w:r>
+        <w:t>• uživateli se zobrazí potvrzovací zpráva.</w:t>
+      </w:r>
+    </w:p>
     <w:p/>
+    <w:p>
+      <w:pPr>
+        <w:rPr>
+          <w:b/>
+          <w:bCs/>
+        </w:rPr>
+      </w:pPr>
+      <w:r>
+        <w:rPr>
+          <w:b/>
+          <w:bCs/>
+        </w:rPr>
+        <w:t>Scénář přihlášení</w:t>
+      </w:r>
+    </w:p>
+    <w:p>
+      <w:r>
+        <w:t xml:space="preserve">• skript načte uživatele podle </w:t>
+      </w:r>
+      <w:proofErr w:type="spellStart"/>
+      <w:r>
+        <w:t>uzivatelske_jmeno</w:t>
+      </w:r>
+      <w:proofErr w:type="spellEnd"/>
+      <w:r>
+        <w:t>;</w:t>
+      </w:r>
+    </w:p>
+    <w:p>
+      <w:r>
+        <w:t xml:space="preserve">• porovná zadané heslo s uloženým </w:t>
+      </w:r>
+      <w:proofErr w:type="spellStart"/>
+      <w:r>
+        <w:t>heslo_hash</w:t>
+      </w:r>
+      <w:proofErr w:type="spellEnd"/>
+      <w:r>
+        <w:t xml:space="preserve"> pomocí </w:t>
+      </w:r>
+      <w:proofErr w:type="spellStart"/>
+      <w:r>
+        <w:t>password_verify</w:t>
+      </w:r>
+      <w:proofErr w:type="spellEnd"/>
+      <w:r>
+        <w:t>();</w:t>
+      </w:r>
+    </w:p>
+    <w:p>
+      <w:r>
+        <w:t>• při úspěchu zapíše do session klíče user a id;</w:t>
+      </w:r>
+    </w:p>
+    <w:p>
+      <w:r>
+        <w:t xml:space="preserve">• uživatele přesměruje na </w:t>
+      </w:r>
+      <w:proofErr w:type="spellStart"/>
+      <w:r>
+        <w:t>dashboard.php</w:t>
+      </w:r>
+      <w:proofErr w:type="spellEnd"/>
+      <w:r>
+        <w:t>;</w:t>
+      </w:r>
+    </w:p>
+    <w:p>
+      <w:r>
+        <w:t>• při neúspěchu zobrazí hlášku „Chyba přihlášení“.</w:t>
+      </w:r>
+    </w:p>
+    <w:p>
+      <w:pPr>
+        <w:pStyle w:val="Nadpis2"/>
+      </w:pPr>
+      <w:bookmarkStart w:id="24" w:name="_Toc227005807"/>
+      <w:r>
+        <w:t>5.</w:t>
+      </w:r>
+      <w:r>
+        <w:t>5. Detail jednotlivých stránek</w:t>
+      </w:r>
+      <w:bookmarkEnd w:id="24"/>
+    </w:p>
+    <w:p>
+      <w:pPr>
+        <w:rPr>
+          <w:b/>
+          <w:bCs/>
+        </w:rPr>
+      </w:pPr>
+      <w:proofErr w:type="spellStart"/>
+      <w:r>
+        <w:rPr>
+          <w:b/>
+          <w:bCs/>
+        </w:rPr>
+        <w:t>index.php</w:t>
+      </w:r>
+      <w:proofErr w:type="spellEnd"/>
+    </w:p>
+    <w:p>
+      <w:r>
+        <w:t>Slouží jako vstupní bod aplikace. Nepoužívá databázi ani session; pouze nabízí dvě akce: registraci a přihlášení.</w:t>
+      </w:r>
+    </w:p>
+    <w:p>
+      <w:pPr>
+        <w:rPr>
+          <w:b/>
+          <w:bCs/>
+        </w:rPr>
+      </w:pPr>
+      <w:proofErr w:type="spellStart"/>
+      <w:r>
+        <w:rPr>
+          <w:b/>
+          <w:bCs/>
+        </w:rPr>
+        <w:t>register.php</w:t>
+      </w:r>
+      <w:proofErr w:type="spellEnd"/>
+    </w:p>
+    <w:p>
+      <w:r>
+        <w:t xml:space="preserve">Po odeslání formuláře validuje vyplněnost polí, ověří kolizi </w:t>
+      </w:r>
+      <w:proofErr w:type="spellStart"/>
+      <w:r>
+        <w:t>username</w:t>
+      </w:r>
+      <w:proofErr w:type="spellEnd"/>
+      <w:r>
+        <w:t>/e-mailu a vloží nového uživatele do databáze. Heslo není ukládáno v otevřeném tvaru.</w:t>
+      </w:r>
+    </w:p>
+    <w:p>
+      <w:pPr>
+        <w:rPr>
+          <w:b/>
+          <w:bCs/>
+        </w:rPr>
+      </w:pPr>
+      <w:proofErr w:type="spellStart"/>
+      <w:r>
+        <w:rPr>
+          <w:b/>
+          <w:bCs/>
+        </w:rPr>
+        <w:t>login.php</w:t>
+      </w:r>
+      <w:proofErr w:type="spellEnd"/>
+    </w:p>
+    <w:p>
+      <w:r>
+        <w:t>Spouští session, čte uživatelský účet z databáze a při úspěšném ověření uloží identifikaci uživatele do relace. Nepoužívá role ani víceúrovňová oprávnění.</w:t>
+      </w:r>
+    </w:p>
+    <w:p>
+      <w:pPr>
+        <w:rPr>
+          <w:b/>
+          <w:bCs/>
+        </w:rPr>
+      </w:pPr>
+      <w:proofErr w:type="spellStart"/>
+      <w:r>
+        <w:rPr>
+          <w:b/>
+          <w:bCs/>
+        </w:rPr>
+        <w:t>dashboard.php</w:t>
+      </w:r>
+      <w:proofErr w:type="spellEnd"/>
+    </w:p>
+    <w:p>
+      <w:r>
+        <w:t xml:space="preserve">Vyžaduje aktivní session. Načte e-mail, datum registrace a příznak </w:t>
+      </w:r>
+      <w:proofErr w:type="spellStart"/>
+      <w:r>
+        <w:t>aktivni</w:t>
+      </w:r>
+      <w:proofErr w:type="spellEnd"/>
+      <w:r>
+        <w:t xml:space="preserve"> z tabulky </w:t>
+      </w:r>
+      <w:proofErr w:type="spellStart"/>
+      <w:r>
+        <w:t>uzivatele</w:t>
+      </w:r>
+      <w:proofErr w:type="spellEnd"/>
+      <w:r>
+        <w:t xml:space="preserve">. Následně se pokusí dohledat jednu přiřazenou doménu z tabulky </w:t>
+      </w:r>
+      <w:proofErr w:type="spellStart"/>
+      <w:r>
+        <w:t>domeny</w:t>
+      </w:r>
+      <w:proofErr w:type="spellEnd"/>
+      <w:r>
+        <w:t xml:space="preserve"> a nabídne odkaz na web.</w:t>
+      </w:r>
+    </w:p>
     <w:p/>
+    <w:p>
+      <w:pPr>
+        <w:rPr>
+          <w:b/>
+          <w:bCs/>
+        </w:rPr>
+      </w:pPr>
+      <w:proofErr w:type="spellStart"/>
+      <w:r>
+        <w:rPr>
+          <w:b/>
+          <w:bCs/>
+        </w:rPr>
+        <w:lastRenderedPageBreak/>
+        <w:t>logout.php</w:t>
+      </w:r>
+      <w:proofErr w:type="spellEnd"/>
+    </w:p>
+    <w:p>
+      <w:r>
+        <w:t xml:space="preserve">Jednoduché ukončení relace přes </w:t>
+      </w:r>
+      <w:proofErr w:type="spellStart"/>
+      <w:r>
+        <w:t>session_destroy</w:t>
+      </w:r>
+      <w:proofErr w:type="spellEnd"/>
+      <w:r>
+        <w:t>() a přesměrování na login.</w:t>
+      </w:r>
+    </w:p>
+    <w:p>
+      <w:pPr>
+        <w:rPr>
+          <w:b/>
+          <w:bCs/>
+        </w:rPr>
+      </w:pPr>
+      <w:proofErr w:type="spellStart"/>
+      <w:r>
+        <w:rPr>
+          <w:b/>
+          <w:bCs/>
+        </w:rPr>
+        <w:t>db.php</w:t>
+      </w:r>
+      <w:proofErr w:type="spellEnd"/>
+    </w:p>
+    <w:p>
+      <w:r>
+        <w:t xml:space="preserve">Sestavuje DSN řetězec z proměnných prostředí DB_HOST, DB_PORT, DB_NAME, DB_USER a DB_PASSWORD. Nastavuje PDO do režimu výjimek a asociativního </w:t>
+      </w:r>
+      <w:proofErr w:type="spellStart"/>
+      <w:r>
+        <w:t>fetch</w:t>
+      </w:r>
+      <w:proofErr w:type="spellEnd"/>
+      <w:r>
+        <w:t xml:space="preserve"> módu.</w:t>
+      </w:r>
+    </w:p>
+    <w:p>
+      <w:pPr>
+        <w:pStyle w:val="Nadpis2"/>
+      </w:pPr>
+      <w:bookmarkStart w:id="25" w:name="_Toc227005808"/>
+      <w:r>
+        <w:t>5.</w:t>
+      </w:r>
+      <w:r>
+        <w:t>6. Databázový model používaný aplikací</w:t>
+      </w:r>
+      <w:bookmarkEnd w:id="25"/>
+    </w:p>
+    <w:p>
+      <w:r>
+        <w:t xml:space="preserve">APP část aktivně používá dvě tabulky: </w:t>
+      </w:r>
+      <w:proofErr w:type="spellStart"/>
+      <w:r>
+        <w:t>uzivatele</w:t>
+      </w:r>
+      <w:proofErr w:type="spellEnd"/>
+      <w:r>
+        <w:t xml:space="preserve"> a </w:t>
+      </w:r>
+      <w:proofErr w:type="spellStart"/>
+      <w:r>
+        <w:t>domeny</w:t>
+      </w:r>
+      <w:proofErr w:type="spellEnd"/>
+      <w:r>
+        <w:t xml:space="preserve">. Zápis probíhá pouze do </w:t>
+      </w:r>
+      <w:proofErr w:type="spellStart"/>
+      <w:r>
+        <w:t>uzivatele</w:t>
+      </w:r>
+      <w:proofErr w:type="spellEnd"/>
+      <w:r>
+        <w:t xml:space="preserve">; tabulka </w:t>
+      </w:r>
+      <w:proofErr w:type="spellStart"/>
+      <w:r>
+        <w:t>domeny</w:t>
+      </w:r>
+      <w:proofErr w:type="spellEnd"/>
+      <w:r>
+        <w:t xml:space="preserve"> je v APP jen čtena pro zobrazení odkazu v dashboardu.</w:t>
+      </w:r>
+    </w:p>
     <w:p/>
+    <w:tbl>
+      <w:tblPr>
+        <w:tblStyle w:val="Mkatabulky"/>
+        <w:tblW w:w="0" w:type="auto"/>
+        <w:jc w:val="center"/>
+        <w:tblLook w:val="04A0" w:firstRow="1" w:lastRow="0" w:firstColumn="1" w:lastColumn="0" w:noHBand="0" w:noVBand="1"/>
+      </w:tblPr>
+      <w:tblGrid>
+        <w:gridCol w:w="1531"/>
+        <w:gridCol w:w="3402"/>
+        <w:gridCol w:w="1871"/>
+        <w:gridCol w:w="1984"/>
+      </w:tblGrid>
+      <w:tr>
+        <w:trPr>
+          <w:jc w:val="center"/>
+        </w:trPr>
+        <w:tc>
+          <w:tcPr>
+            <w:tcW w:w="1531" w:type="dxa"/>
+            <w:tcBorders>
+              <w:top w:val="single" w:sz="4" w:space="0" w:color="auto"/>
+              <w:left w:val="single" w:sz="4" w:space="0" w:color="auto"/>
+              <w:bottom w:val="single" w:sz="4" w:space="0" w:color="auto"/>
+              <w:right w:val="single" w:sz="4" w:space="0" w:color="auto"/>
+            </w:tcBorders>
+            <w:shd w:val="clear" w:color="auto" w:fill="2F75B5"/>
+            <w:vAlign w:val="center"/>
+            <w:hideMark/>
+          </w:tcPr>
+          <w:p>
+            <w:r>
+              <w:rPr>
+                <w:b/>
+              </w:rPr>
+              <w:t>Tabulka</w:t>
+            </w:r>
+          </w:p>
+        </w:tc>
+        <w:tc>
+          <w:tcPr>
+            <w:tcW w:w="3402" w:type="dxa"/>
+            <w:tcBorders>
+              <w:top w:val="single" w:sz="4" w:space="0" w:color="auto"/>
+              <w:left w:val="single" w:sz="4" w:space="0" w:color="auto"/>
+              <w:bottom w:val="single" w:sz="4" w:space="0" w:color="auto"/>
+              <w:right w:val="single" w:sz="4" w:space="0" w:color="auto"/>
+            </w:tcBorders>
+            <w:shd w:val="clear" w:color="auto" w:fill="2F75B5"/>
+            <w:vAlign w:val="center"/>
+            <w:hideMark/>
+          </w:tcPr>
+          <w:p>
+            <w:r>
+              <w:rPr>
+                <w:b/>
+              </w:rPr>
+              <w:t>Klíčové sloupce</w:t>
+            </w:r>
+          </w:p>
+        </w:tc>
+        <w:tc>
+          <w:tcPr>
+            <w:tcW w:w="1871" w:type="dxa"/>
+            <w:tcBorders>
+              <w:top w:val="single" w:sz="4" w:space="0" w:color="auto"/>
+              <w:left w:val="single" w:sz="4" w:space="0" w:color="auto"/>
+              <w:bottom w:val="single" w:sz="4" w:space="0" w:color="auto"/>
+              <w:right w:val="single" w:sz="4" w:space="0" w:color="auto"/>
+            </w:tcBorders>
+            <w:shd w:val="clear" w:color="auto" w:fill="2F75B5"/>
+            <w:vAlign w:val="center"/>
+            <w:hideMark/>
+          </w:tcPr>
+          <w:p>
+            <w:r>
+              <w:rPr>
+                <w:b/>
+              </w:rPr>
+              <w:t>Použití v APP</w:t>
+            </w:r>
+          </w:p>
+        </w:tc>
+        <w:tc>
+          <w:tcPr>
+            <w:tcW w:w="1984" w:type="dxa"/>
+            <w:tcBorders>
+              <w:top w:val="single" w:sz="4" w:space="0" w:color="auto"/>
+              <w:left w:val="single" w:sz="4" w:space="0" w:color="auto"/>
+              <w:bottom w:val="single" w:sz="4" w:space="0" w:color="auto"/>
+              <w:right w:val="single" w:sz="4" w:space="0" w:color="auto"/>
+            </w:tcBorders>
+            <w:shd w:val="clear" w:color="auto" w:fill="2F75B5"/>
+            <w:vAlign w:val="center"/>
+            <w:hideMark/>
+          </w:tcPr>
+          <w:p>
+            <w:r>
+              <w:rPr>
+                <w:b/>
+              </w:rPr>
+              <w:t>Operace</w:t>
+            </w:r>
+          </w:p>
+        </w:tc>
+      </w:tr>
+      <w:tr>
+        <w:trPr>
+          <w:jc w:val="center"/>
+        </w:trPr>
+        <w:tc>
+          <w:tcPr>
+            <w:tcW w:w="1531" w:type="dxa"/>
+            <w:tcBorders>
+              <w:top w:val="single" w:sz="4" w:space="0" w:color="auto"/>
+              <w:left w:val="single" w:sz="4" w:space="0" w:color="auto"/>
+              <w:bottom w:val="single" w:sz="4" w:space="0" w:color="auto"/>
+              <w:right w:val="single" w:sz="4" w:space="0" w:color="auto"/>
+            </w:tcBorders>
+            <w:vAlign w:val="center"/>
+            <w:hideMark/>
+          </w:tcPr>
+          <w:p>
+            <w:proofErr w:type="spellStart"/>
+            <w:r>
+              <w:t>uzivatele</w:t>
+            </w:r>
+            <w:proofErr w:type="spellEnd"/>
+          </w:p>
+        </w:tc>
+        <w:tc>
+          <w:tcPr>
+            <w:tcW w:w="3402" w:type="dxa"/>
+            <w:tcBorders>
+              <w:top w:val="single" w:sz="4" w:space="0" w:color="auto"/>
+              <w:left w:val="single" w:sz="4" w:space="0" w:color="auto"/>
+              <w:bottom w:val="single" w:sz="4" w:space="0" w:color="auto"/>
+              <w:right w:val="single" w:sz="4" w:space="0" w:color="auto"/>
+            </w:tcBorders>
+            <w:vAlign w:val="center"/>
+            <w:hideMark/>
+          </w:tcPr>
+          <w:p>
+            <w:r>
+              <w:t xml:space="preserve">id, </w:t>
+            </w:r>
+            <w:proofErr w:type="spellStart"/>
+            <w:r>
+              <w:t>uzivatelske_jmeno</w:t>
+            </w:r>
+            <w:proofErr w:type="spellEnd"/>
+            <w:r>
+              <w:t xml:space="preserve">, email, </w:t>
+            </w:r>
+            <w:proofErr w:type="spellStart"/>
+            <w:r>
+              <w:t>heslo_hash</w:t>
+            </w:r>
+            <w:proofErr w:type="spellEnd"/>
+            <w:r>
+              <w:t xml:space="preserve">, </w:t>
+            </w:r>
+            <w:proofErr w:type="spellStart"/>
+            <w:r>
+              <w:t>datum_registrace</w:t>
+            </w:r>
+            <w:proofErr w:type="spellEnd"/>
+            <w:r>
+              <w:t xml:space="preserve">, </w:t>
+            </w:r>
+            <w:proofErr w:type="spellStart"/>
+            <w:r>
+              <w:t>aktivni</w:t>
+            </w:r>
+            <w:proofErr w:type="spellEnd"/>
+          </w:p>
+        </w:tc>
+        <w:tc>
+          <w:tcPr>
+            <w:tcW w:w="1871" w:type="dxa"/>
+            <w:tcBorders>
+              <w:top w:val="single" w:sz="4" w:space="0" w:color="auto"/>
+              <w:left w:val="single" w:sz="4" w:space="0" w:color="auto"/>
+              <w:bottom w:val="single" w:sz="4" w:space="0" w:color="auto"/>
+              <w:right w:val="single" w:sz="4" w:space="0" w:color="auto"/>
+            </w:tcBorders>
+            <w:vAlign w:val="center"/>
+            <w:hideMark/>
+          </w:tcPr>
+          <w:p>
+            <w:r>
+              <w:t>registrace, login, dashboard</w:t>
+            </w:r>
+          </w:p>
+        </w:tc>
+        <w:tc>
+          <w:tcPr>
+            <w:tcW w:w="1984" w:type="dxa"/>
+            <w:tcBorders>
+              <w:top w:val="single" w:sz="4" w:space="0" w:color="auto"/>
+              <w:left w:val="single" w:sz="4" w:space="0" w:color="auto"/>
+              <w:bottom w:val="single" w:sz="4" w:space="0" w:color="auto"/>
+              <w:right w:val="single" w:sz="4" w:space="0" w:color="auto"/>
+            </w:tcBorders>
+            <w:vAlign w:val="center"/>
+            <w:hideMark/>
+          </w:tcPr>
+          <w:p>
+            <w:r>
+              <w:t>SELECT, INSERT</w:t>
+            </w:r>
+          </w:p>
+        </w:tc>
+      </w:tr>
+      <w:tr>
+        <w:trPr>
+          <w:jc w:val="center"/>
+        </w:trPr>
+        <w:tc>
+          <w:tcPr>
+            <w:tcW w:w="1531" w:type="dxa"/>
+            <w:tcBorders>
+              <w:top w:val="single" w:sz="4" w:space="0" w:color="auto"/>
+              <w:left w:val="single" w:sz="4" w:space="0" w:color="auto"/>
+              <w:bottom w:val="single" w:sz="4" w:space="0" w:color="auto"/>
+              <w:right w:val="single" w:sz="4" w:space="0" w:color="auto"/>
+            </w:tcBorders>
+            <w:vAlign w:val="center"/>
+            <w:hideMark/>
+          </w:tcPr>
+          <w:p>
+            <w:proofErr w:type="spellStart"/>
+            <w:r>
+              <w:t>domeny</w:t>
+            </w:r>
+            <w:proofErr w:type="spellEnd"/>
+          </w:p>
+        </w:tc>
+        <w:tc>
+          <w:tcPr>
+            <w:tcW w:w="3402" w:type="dxa"/>
+            <w:tcBorders>
+              <w:top w:val="single" w:sz="4" w:space="0" w:color="auto"/>
+              <w:left w:val="single" w:sz="4" w:space="0" w:color="auto"/>
+              <w:bottom w:val="single" w:sz="4" w:space="0" w:color="auto"/>
+              <w:right w:val="single" w:sz="4" w:space="0" w:color="auto"/>
+            </w:tcBorders>
+            <w:vAlign w:val="center"/>
+            <w:hideMark/>
+          </w:tcPr>
+          <w:p>
+            <w:r>
+              <w:t xml:space="preserve">id, </w:t>
+            </w:r>
+            <w:proofErr w:type="spellStart"/>
+            <w:r>
+              <w:t>uzivatel_id</w:t>
+            </w:r>
+            <w:proofErr w:type="spellEnd"/>
+            <w:r>
+              <w:t xml:space="preserve">, </w:t>
+            </w:r>
+            <w:proofErr w:type="spellStart"/>
+            <w:r>
+              <w:t>domena</w:t>
+            </w:r>
+            <w:proofErr w:type="spellEnd"/>
+            <w:r>
+              <w:t xml:space="preserve">, </w:t>
+            </w:r>
+            <w:proofErr w:type="spellStart"/>
+            <w:r>
+              <w:t>ftp</w:t>
+            </w:r>
+            <w:proofErr w:type="spellEnd"/>
+            <w:r>
+              <w:t>_*</w:t>
+            </w:r>
+          </w:p>
+        </w:tc>
+        <w:tc>
+          <w:tcPr>
+            <w:tcW w:w="1871" w:type="dxa"/>
+            <w:tcBorders>
+              <w:top w:val="single" w:sz="4" w:space="0" w:color="auto"/>
+              <w:left w:val="single" w:sz="4" w:space="0" w:color="auto"/>
+              <w:bottom w:val="single" w:sz="4" w:space="0" w:color="auto"/>
+              <w:right w:val="single" w:sz="4" w:space="0" w:color="auto"/>
+            </w:tcBorders>
+            <w:vAlign w:val="center"/>
+            <w:hideMark/>
+          </w:tcPr>
+          <w:p>
+            <w:r>
+              <w:t>dashboard</w:t>
+            </w:r>
+          </w:p>
+        </w:tc>
+        <w:tc>
+          <w:tcPr>
+            <w:tcW w:w="1984" w:type="dxa"/>
+            <w:tcBorders>
+              <w:top w:val="single" w:sz="4" w:space="0" w:color="auto"/>
+              <w:left w:val="single" w:sz="4" w:space="0" w:color="auto"/>
+              <w:bottom w:val="single" w:sz="4" w:space="0" w:color="auto"/>
+              <w:right w:val="single" w:sz="4" w:space="0" w:color="auto"/>
+            </w:tcBorders>
+            <w:vAlign w:val="center"/>
+            <w:hideMark/>
+          </w:tcPr>
+          <w:p>
+            <w:r>
+              <w:t>SELECT</w:t>
+            </w:r>
+          </w:p>
+        </w:tc>
+      </w:tr>
+      <w:tr>
+        <w:trPr>
+          <w:jc w:val="center"/>
+        </w:trPr>
+        <w:tc>
+          <w:tcPr>
+            <w:tcW w:w="1531" w:type="dxa"/>
+            <w:tcBorders>
+              <w:top w:val="single" w:sz="4" w:space="0" w:color="auto"/>
+              <w:left w:val="single" w:sz="4" w:space="0" w:color="auto"/>
+              <w:bottom w:val="single" w:sz="4" w:space="0" w:color="auto"/>
+              <w:right w:val="single" w:sz="4" w:space="0" w:color="auto"/>
+            </w:tcBorders>
+            <w:vAlign w:val="center"/>
+          </w:tcPr>
+          <w:p/>
+        </w:tc>
+        <w:tc>
+          <w:tcPr>
+            <w:tcW w:w="3402" w:type="dxa"/>
+            <w:tcBorders>
+              <w:top w:val="single" w:sz="4" w:space="0" w:color="auto"/>
+              <w:left w:val="single" w:sz="4" w:space="0" w:color="auto"/>
+              <w:bottom w:val="single" w:sz="4" w:space="0" w:color="auto"/>
+              <w:right w:val="single" w:sz="4" w:space="0" w:color="auto"/>
+            </w:tcBorders>
+            <w:vAlign w:val="center"/>
+          </w:tcPr>
+          <w:p/>
+        </w:tc>
+        <w:tc>
+          <w:tcPr>
+            <w:tcW w:w="1871" w:type="dxa"/>
+            <w:tcBorders>
+              <w:top w:val="single" w:sz="4" w:space="0" w:color="auto"/>
+              <w:left w:val="single" w:sz="4" w:space="0" w:color="auto"/>
+              <w:bottom w:val="single" w:sz="4" w:space="0" w:color="auto"/>
+              <w:right w:val="single" w:sz="4" w:space="0" w:color="auto"/>
+            </w:tcBorders>
+            <w:vAlign w:val="center"/>
+          </w:tcPr>
+          <w:p/>
+        </w:tc>
+        <w:tc>
+          <w:tcPr>
+            <w:tcW w:w="1984" w:type="dxa"/>
+            <w:tcBorders>
+              <w:top w:val="single" w:sz="4" w:space="0" w:color="auto"/>
+              <w:left w:val="single" w:sz="4" w:space="0" w:color="auto"/>
+              <w:bottom w:val="single" w:sz="4" w:space="0" w:color="auto"/>
+              <w:right w:val="single" w:sz="4" w:space="0" w:color="auto"/>
+            </w:tcBorders>
+            <w:vAlign w:val="center"/>
+          </w:tcPr>
+          <w:p/>
+        </w:tc>
+      </w:tr>
+    </w:tbl>
+    <w:p>
+      <w:pPr>
+        <w:rPr>
+          <w:b/>
+          <w:bCs/>
+        </w:rPr>
+      </w:pPr>
+      <w:r>
+        <w:rPr>
+          <w:b/>
+          <w:bCs/>
+        </w:rPr>
+        <w:t>Důležité vazby a předpoklady:</w:t>
+      </w:r>
+    </w:p>
+    <w:p>
+      <w:r>
+        <w:t xml:space="preserve">• dashboard očekává, že doména je v tabulce </w:t>
+      </w:r>
+      <w:proofErr w:type="spellStart"/>
+      <w:r>
+        <w:t>domeny</w:t>
+      </w:r>
+      <w:proofErr w:type="spellEnd"/>
+      <w:r>
+        <w:t xml:space="preserve"> navázaná přes </w:t>
+      </w:r>
+      <w:proofErr w:type="spellStart"/>
+      <w:r>
+        <w:t>domeny.uzivatel_id</w:t>
+      </w:r>
+      <w:proofErr w:type="spellEnd"/>
+      <w:r>
+        <w:t xml:space="preserve"> = uzivatele.id;</w:t>
+      </w:r>
+    </w:p>
+    <w:p>
+      <w:r>
+        <w:t>• APP sama žádnou doménu nevytváří; bez externího procesu se zobrazí text „Žádná doména zatím není přiřazena“;</w:t>
+      </w:r>
+    </w:p>
+    <w:p>
+      <w:r>
+        <w:t>• pokud databáze nebude inicializovaná správně, registrace ani přihlášení nebudou fungovat.</w:t>
+      </w:r>
+    </w:p>
+    <w:p>
+      <w:pPr>
+        <w:pStyle w:val="Nadpis2"/>
+      </w:pPr>
+      <w:bookmarkStart w:id="26" w:name="_Toc227005809"/>
+      <w:r>
+        <w:t>5.</w:t>
+      </w:r>
+      <w:r>
+        <w:t>7. Konfigurace a spuštění</w:t>
+      </w:r>
+      <w:bookmarkEnd w:id="26"/>
+    </w:p>
+    <w:p>
+      <w:r>
+        <w:t xml:space="preserve">APP je navržená pro běh v </w:t>
+      </w:r>
+      <w:proofErr w:type="spellStart"/>
+      <w:r>
+        <w:t>Docker</w:t>
+      </w:r>
+      <w:proofErr w:type="spellEnd"/>
+      <w:r>
+        <w:t xml:space="preserve"> </w:t>
+      </w:r>
+      <w:proofErr w:type="spellStart"/>
+      <w:r>
+        <w:t>Compose</w:t>
+      </w:r>
+      <w:proofErr w:type="spellEnd"/>
+      <w:r>
+        <w:t>. Pro lokální spuštění je potřeba vytvořit soubor .</w:t>
+      </w:r>
+      <w:proofErr w:type="spellStart"/>
+      <w:r>
+        <w:t>env</w:t>
+      </w:r>
+      <w:proofErr w:type="spellEnd"/>
+      <w:r>
+        <w:t xml:space="preserve"> podle .</w:t>
+      </w:r>
+      <w:proofErr w:type="spellStart"/>
+      <w:r>
+        <w:t>env.example</w:t>
+      </w:r>
+      <w:proofErr w:type="spellEnd"/>
+      <w:r>
+        <w:t xml:space="preserve"> a doplnit skutečné hodnoty hesel.</w:t>
+      </w:r>
+    </w:p>
     <w:p/>
-    <w:p/>
-    <w:p/>
+    <w:tbl>
+      <w:tblPr>
+        <w:tblStyle w:val="Mkatabulky"/>
+        <w:tblW w:w="0" w:type="auto"/>
+        <w:jc w:val="center"/>
+        <w:tblLook w:val="04A0" w:firstRow="1" w:lastRow="0" w:firstColumn="1" w:lastColumn="0" w:noHBand="0" w:noVBand="1"/>
+      </w:tblPr>
+      <w:tblGrid>
+        <w:gridCol w:w="2686"/>
+        <w:gridCol w:w="3402"/>
+        <w:gridCol w:w="2948"/>
+      </w:tblGrid>
+      <w:tr>
+        <w:trPr>
+          <w:jc w:val="center"/>
+        </w:trPr>
+        <w:tc>
+          <w:tcPr>
+            <w:tcW w:w="2381" w:type="dxa"/>
+            <w:tcBorders>
+              <w:top w:val="single" w:sz="4" w:space="0" w:color="auto"/>
+              <w:left w:val="single" w:sz="4" w:space="0" w:color="auto"/>
+              <w:bottom w:val="single" w:sz="4" w:space="0" w:color="auto"/>
+              <w:right w:val="single" w:sz="4" w:space="0" w:color="auto"/>
+            </w:tcBorders>
+            <w:shd w:val="clear" w:color="auto" w:fill="1F4E79"/>
+            <w:vAlign w:val="center"/>
+            <w:hideMark/>
+          </w:tcPr>
+          <w:p>
+            <w:r>
+              <w:rPr>
+                <w:b/>
+              </w:rPr>
+              <w:t>Proměnná</w:t>
+            </w:r>
+          </w:p>
+        </w:tc>
+        <w:tc>
+          <w:tcPr>
+            <w:tcW w:w="3402" w:type="dxa"/>
+            <w:tcBorders>
+              <w:top w:val="single" w:sz="4" w:space="0" w:color="auto"/>
+              <w:left w:val="single" w:sz="4" w:space="0" w:color="auto"/>
+              <w:bottom w:val="single" w:sz="4" w:space="0" w:color="auto"/>
+              <w:right w:val="single" w:sz="4" w:space="0" w:color="auto"/>
+            </w:tcBorders>
+            <w:shd w:val="clear" w:color="auto" w:fill="1F4E79"/>
+            <w:vAlign w:val="center"/>
+            <w:hideMark/>
+          </w:tcPr>
+          <w:p>
+            <w:r>
+              <w:rPr>
+                <w:b/>
+              </w:rPr>
+              <w:t>Význam</w:t>
+            </w:r>
+          </w:p>
+        </w:tc>
+        <w:tc>
+          <w:tcPr>
+            <w:tcW w:w="2948" w:type="dxa"/>
+            <w:tcBorders>
+              <w:top w:val="single" w:sz="4" w:space="0" w:color="auto"/>
+              <w:left w:val="single" w:sz="4" w:space="0" w:color="auto"/>
+              <w:bottom w:val="single" w:sz="4" w:space="0" w:color="auto"/>
+              <w:right w:val="single" w:sz="4" w:space="0" w:color="auto"/>
+            </w:tcBorders>
+            <w:shd w:val="clear" w:color="auto" w:fill="1F4E79"/>
+            <w:vAlign w:val="center"/>
+            <w:hideMark/>
+          </w:tcPr>
+          <w:p>
+            <w:r>
+              <w:rPr>
+                <w:b/>
+              </w:rPr>
+              <w:t>Typická hodnota</w:t>
+            </w:r>
+          </w:p>
+        </w:tc>
+      </w:tr>
+      <w:tr>
+        <w:trPr>
+          <w:jc w:val="center"/>
+        </w:trPr>
+        <w:tc>
+          <w:tcPr>
+            <w:tcW w:w="2381" w:type="dxa"/>
+            <w:tcBorders>
+              <w:top w:val="single" w:sz="4" w:space="0" w:color="auto"/>
+              <w:left w:val="single" w:sz="4" w:space="0" w:color="auto"/>
+              <w:bottom w:val="single" w:sz="4" w:space="0" w:color="auto"/>
+              <w:right w:val="single" w:sz="4" w:space="0" w:color="auto"/>
+            </w:tcBorders>
+            <w:vAlign w:val="center"/>
+            <w:hideMark/>
+          </w:tcPr>
+          <w:p>
+            <w:r>
+              <w:t>APP_ENV</w:t>
+            </w:r>
+          </w:p>
+        </w:tc>
+        <w:tc>
+          <w:tcPr>
+            <w:tcW w:w="3402" w:type="dxa"/>
+            <w:tcBorders>
+              <w:top w:val="single" w:sz="4" w:space="0" w:color="auto"/>
+              <w:left w:val="single" w:sz="4" w:space="0" w:color="auto"/>
+              <w:bottom w:val="single" w:sz="4" w:space="0" w:color="auto"/>
+              <w:right w:val="single" w:sz="4" w:space="0" w:color="auto"/>
+            </w:tcBorders>
+            <w:vAlign w:val="center"/>
+            <w:hideMark/>
+          </w:tcPr>
+          <w:p>
+            <w:r>
+              <w:t>Režim aplikace</w:t>
+            </w:r>
+          </w:p>
+        </w:tc>
+        <w:tc>
+          <w:tcPr>
+            <w:tcW w:w="2948" w:type="dxa"/>
+            <w:tcBorders>
+              <w:top w:val="single" w:sz="4" w:space="0" w:color="auto"/>
+              <w:left w:val="single" w:sz="4" w:space="0" w:color="auto"/>
+              <w:bottom w:val="single" w:sz="4" w:space="0" w:color="auto"/>
+              <w:right w:val="single" w:sz="4" w:space="0" w:color="auto"/>
+            </w:tcBorders>
+            <w:vAlign w:val="center"/>
+            <w:hideMark/>
+          </w:tcPr>
+          <w:p>
+            <w:proofErr w:type="spellStart"/>
+            <w:r>
+              <w:t>dev</w:t>
+            </w:r>
+            <w:proofErr w:type="spellEnd"/>
+          </w:p>
+        </w:tc>
+      </w:tr>
+      <w:tr>
+        <w:trPr>
+          <w:jc w:val="center"/>
+        </w:trPr>
+        <w:tc>
+          <w:tcPr>
+            <w:tcW w:w="2381" w:type="dxa"/>
+            <w:tcBorders>
+              <w:top w:val="single" w:sz="4" w:space="0" w:color="auto"/>
+              <w:left w:val="single" w:sz="4" w:space="0" w:color="auto"/>
+              <w:bottom w:val="single" w:sz="4" w:space="0" w:color="auto"/>
+              <w:right w:val="single" w:sz="4" w:space="0" w:color="auto"/>
+            </w:tcBorders>
+            <w:vAlign w:val="center"/>
+            <w:hideMark/>
+          </w:tcPr>
+          <w:p>
+            <w:r>
+              <w:t>DB_ROOT_PASSWORD</w:t>
+            </w:r>
+          </w:p>
+        </w:tc>
+        <w:tc>
+          <w:tcPr>
+            <w:tcW w:w="3402" w:type="dxa"/>
+            <w:tcBorders>
+              <w:top w:val="single" w:sz="4" w:space="0" w:color="auto"/>
+              <w:left w:val="single" w:sz="4" w:space="0" w:color="auto"/>
+              <w:bottom w:val="single" w:sz="4" w:space="0" w:color="auto"/>
+              <w:right w:val="single" w:sz="4" w:space="0" w:color="auto"/>
+            </w:tcBorders>
+            <w:vAlign w:val="center"/>
+            <w:hideMark/>
+          </w:tcPr>
+          <w:p>
+            <w:r>
+              <w:t xml:space="preserve">Heslo </w:t>
+            </w:r>
+            <w:proofErr w:type="spellStart"/>
+            <w:r>
+              <w:t>root</w:t>
+            </w:r>
+            <w:proofErr w:type="spellEnd"/>
+            <w:r>
+              <w:t xml:space="preserve"> uživatele DB</w:t>
+            </w:r>
+          </w:p>
+        </w:tc>
+        <w:tc>
+          <w:tcPr>
+            <w:tcW w:w="2948" w:type="dxa"/>
+            <w:tcBorders>
+              <w:top w:val="single" w:sz="4" w:space="0" w:color="auto"/>
+              <w:left w:val="single" w:sz="4" w:space="0" w:color="auto"/>
+              <w:bottom w:val="single" w:sz="4" w:space="0" w:color="auto"/>
+              <w:right w:val="single" w:sz="4" w:space="0" w:color="auto"/>
+            </w:tcBorders>
+            <w:vAlign w:val="center"/>
+            <w:hideMark/>
+          </w:tcPr>
+          <w:p>
+            <w:r>
+              <w:t>vlastní tajná hodnota</w:t>
+            </w:r>
+          </w:p>
+        </w:tc>
+      </w:tr>
+      <w:tr>
+        <w:trPr>
+          <w:jc w:val="center"/>
+        </w:trPr>
+        <w:tc>
+          <w:tcPr>
+            <w:tcW w:w="2381" w:type="dxa"/>
+            <w:tcBorders>
+              <w:top w:val="single" w:sz="4" w:space="0" w:color="auto"/>
+              <w:left w:val="single" w:sz="4" w:space="0" w:color="auto"/>
+              <w:bottom w:val="single" w:sz="4" w:space="0" w:color="auto"/>
+              <w:right w:val="single" w:sz="4" w:space="0" w:color="auto"/>
+            </w:tcBorders>
+            <w:vAlign w:val="center"/>
+            <w:hideMark/>
+          </w:tcPr>
+          <w:p>
+            <w:r>
+              <w:t>DB_NAME</w:t>
+            </w:r>
+          </w:p>
+        </w:tc>
+        <w:tc>
+          <w:tcPr>
+            <w:tcW w:w="3402" w:type="dxa"/>
+            <w:tcBorders>
+              <w:top w:val="single" w:sz="4" w:space="0" w:color="auto"/>
+              <w:left w:val="single" w:sz="4" w:space="0" w:color="auto"/>
+              <w:bottom w:val="single" w:sz="4" w:space="0" w:color="auto"/>
+              <w:right w:val="single" w:sz="4" w:space="0" w:color="auto"/>
+            </w:tcBorders>
+            <w:vAlign w:val="center"/>
+            <w:hideMark/>
+          </w:tcPr>
+          <w:p>
+            <w:r>
+              <w:t>Název databáze</w:t>
+            </w:r>
+          </w:p>
+        </w:tc>
+        <w:tc>
+          <w:tcPr>
+            <w:tcW w:w="2948" w:type="dxa"/>
+            <w:tcBorders>
+              <w:top w:val="single" w:sz="4" w:space="0" w:color="auto"/>
+              <w:left w:val="single" w:sz="4" w:space="0" w:color="auto"/>
+              <w:bottom w:val="single" w:sz="4" w:space="0" w:color="auto"/>
+              <w:right w:val="single" w:sz="4" w:space="0" w:color="auto"/>
+            </w:tcBorders>
+            <w:vAlign w:val="center"/>
+            <w:hideMark/>
+          </w:tcPr>
+          <w:p>
+            <w:proofErr w:type="spellStart"/>
+            <w:r>
+              <w:t>hosting_db</w:t>
+            </w:r>
+            <w:proofErr w:type="spellEnd"/>
+          </w:p>
+        </w:tc>
+      </w:tr>
+      <w:tr>
+        <w:trPr>
+          <w:jc w:val="center"/>
+        </w:trPr>
+        <w:tc>
+          <w:tcPr>
+            <w:tcW w:w="2381" w:type="dxa"/>
+            <w:tcBorders>
+              <w:top w:val="single" w:sz="4" w:space="0" w:color="auto"/>
+              <w:left w:val="single" w:sz="4" w:space="0" w:color="auto"/>
+              <w:bottom w:val="single" w:sz="4" w:space="0" w:color="auto"/>
+              <w:right w:val="single" w:sz="4" w:space="0" w:color="auto"/>
+            </w:tcBorders>
+            <w:vAlign w:val="center"/>
+            <w:hideMark/>
+          </w:tcPr>
+          <w:p>
+            <w:r>
+              <w:t>DB_USER</w:t>
+            </w:r>
+          </w:p>
+        </w:tc>
+        <w:tc>
+          <w:tcPr>
+            <w:tcW w:w="3402" w:type="dxa"/>
+            <w:tcBorders>
+              <w:top w:val="single" w:sz="4" w:space="0" w:color="auto"/>
+              <w:left w:val="single" w:sz="4" w:space="0" w:color="auto"/>
+              <w:bottom w:val="single" w:sz="4" w:space="0" w:color="auto"/>
+              <w:right w:val="single" w:sz="4" w:space="0" w:color="auto"/>
+            </w:tcBorders>
+            <w:vAlign w:val="center"/>
+            <w:hideMark/>
+          </w:tcPr>
+          <w:p>
+            <w:r>
+              <w:t>Aplikační DB účet</w:t>
+            </w:r>
+          </w:p>
+        </w:tc>
+        <w:tc>
+          <w:tcPr>
+            <w:tcW w:w="2948" w:type="dxa"/>
+            <w:tcBorders>
+              <w:top w:val="single" w:sz="4" w:space="0" w:color="auto"/>
+              <w:left w:val="single" w:sz="4" w:space="0" w:color="auto"/>
+              <w:bottom w:val="single" w:sz="4" w:space="0" w:color="auto"/>
+              <w:right w:val="single" w:sz="4" w:space="0" w:color="auto"/>
+            </w:tcBorders>
+            <w:vAlign w:val="center"/>
+            <w:hideMark/>
+          </w:tcPr>
+          <w:p>
+            <w:proofErr w:type="spellStart"/>
+            <w:r>
+              <w:t>appuser</w:t>
+            </w:r>
+            <w:proofErr w:type="spellEnd"/>
+          </w:p>
+        </w:tc>
+      </w:tr>
+      <w:tr>
+        <w:trPr>
+          <w:jc w:val="center"/>
+        </w:trPr>
+        <w:tc>
+          <w:tcPr>
+            <w:tcW w:w="2381" w:type="dxa"/>
+            <w:tcBorders>
+              <w:top w:val="single" w:sz="4" w:space="0" w:color="auto"/>
+              <w:left w:val="single" w:sz="4" w:space="0" w:color="auto"/>
+              <w:bottom w:val="single" w:sz="4" w:space="0" w:color="auto"/>
+              <w:right w:val="single" w:sz="4" w:space="0" w:color="auto"/>
+            </w:tcBorders>
+            <w:vAlign w:val="center"/>
+            <w:hideMark/>
+          </w:tcPr>
+          <w:p>
+            <w:r>
+              <w:t>DB_PASSWORD</w:t>
+            </w:r>
+          </w:p>
+        </w:tc>
+        <w:tc>
+          <w:tcPr>
+            <w:tcW w:w="3402" w:type="dxa"/>
+            <w:tcBorders>
+              <w:top w:val="single" w:sz="4" w:space="0" w:color="auto"/>
+              <w:left w:val="single" w:sz="4" w:space="0" w:color="auto"/>
+              <w:bottom w:val="single" w:sz="4" w:space="0" w:color="auto"/>
+              <w:right w:val="single" w:sz="4" w:space="0" w:color="auto"/>
+            </w:tcBorders>
+            <w:vAlign w:val="center"/>
+            <w:hideMark/>
+          </w:tcPr>
+          <w:p>
+            <w:r>
+              <w:t>Heslo aplikačního účtu</w:t>
+            </w:r>
+          </w:p>
+        </w:tc>
+        <w:tc>
+          <w:tcPr>
+            <w:tcW w:w="2948" w:type="dxa"/>
+            <w:tcBorders>
+              <w:top w:val="single" w:sz="4" w:space="0" w:color="auto"/>
+              <w:left w:val="single" w:sz="4" w:space="0" w:color="auto"/>
+              <w:bottom w:val="single" w:sz="4" w:space="0" w:color="auto"/>
+              <w:right w:val="single" w:sz="4" w:space="0" w:color="auto"/>
+            </w:tcBorders>
+            <w:vAlign w:val="center"/>
+            <w:hideMark/>
+          </w:tcPr>
+          <w:p>
+            <w:r>
+              <w:t>vlastní tajná hodnota</w:t>
+            </w:r>
+          </w:p>
+        </w:tc>
+      </w:tr>
+    </w:tbl>
+    <w:p>
+      <w:pPr>
+        <w:rPr>
+          <w:b/>
+          <w:bCs/>
+        </w:rPr>
+      </w:pPr>
+      <w:r>
+        <w:rPr>
+          <w:b/>
+          <w:bCs/>
+        </w:rPr>
+        <w:t>Doporučený postup spuštění:</w:t>
+      </w:r>
+    </w:p>
+    <w:p>
+      <w:r>
+        <w:t>• zkopírovat .</w:t>
+      </w:r>
+      <w:proofErr w:type="spellStart"/>
+      <w:r>
+        <w:t>env.example</w:t>
+      </w:r>
+      <w:proofErr w:type="spellEnd"/>
+      <w:r>
+        <w:t xml:space="preserve"> na .</w:t>
+      </w:r>
+      <w:proofErr w:type="spellStart"/>
+      <w:r>
+        <w:t>env</w:t>
+      </w:r>
+      <w:proofErr w:type="spellEnd"/>
+      <w:r>
+        <w:t xml:space="preserve"> a upravit hesla;</w:t>
+      </w:r>
+    </w:p>
+    <w:p>
+      <w:r>
+        <w:t xml:space="preserve">• spustit </w:t>
+      </w:r>
+      <w:proofErr w:type="spellStart"/>
+      <w:r>
+        <w:t>docker</w:t>
+      </w:r>
+      <w:proofErr w:type="spellEnd"/>
+      <w:r>
+        <w:t xml:space="preserve"> </w:t>
+      </w:r>
+      <w:proofErr w:type="spellStart"/>
+      <w:r>
+        <w:t>compose</w:t>
+      </w:r>
+      <w:proofErr w:type="spellEnd"/>
+      <w:r>
+        <w:t xml:space="preserve"> up --build;</w:t>
+      </w:r>
+    </w:p>
+    <w:p>
+      <w:r>
+        <w:t xml:space="preserve">• ověřit start služby </w:t>
+      </w:r>
+      <w:proofErr w:type="spellStart"/>
+      <w:r>
+        <w:t>mariadb</w:t>
+      </w:r>
+      <w:proofErr w:type="spellEnd"/>
+      <w:r>
+        <w:t xml:space="preserve"> a až poté služby web;</w:t>
+      </w:r>
+    </w:p>
+    <w:p>
+      <w:r>
+        <w:t>• otevřít aplikaci přes port 80 na hostiteli.</w:t>
+      </w:r>
+    </w:p>
+    <w:p>
+      <w:pPr>
+        <w:pStyle w:val="Nadpis2"/>
+      </w:pPr>
+      <w:bookmarkStart w:id="27" w:name="_Toc227005810"/>
+      <w:r>
+        <w:t>5.</w:t>
+      </w:r>
+      <w:r>
+        <w:t>8. Bezpečnostní vlastnosti</w:t>
+      </w:r>
+      <w:bookmarkEnd w:id="27"/>
+    </w:p>
+    <w:p>
+      <w:r>
+        <w:t xml:space="preserve">• hesla jsou </w:t>
+      </w:r>
+      <w:proofErr w:type="spellStart"/>
+      <w:r>
+        <w:t>hashována</w:t>
+      </w:r>
+      <w:proofErr w:type="spellEnd"/>
+      <w:r>
+        <w:t xml:space="preserve"> funkcí </w:t>
+      </w:r>
+      <w:proofErr w:type="spellStart"/>
+      <w:r>
+        <w:t>password_hash</w:t>
+      </w:r>
+      <w:proofErr w:type="spellEnd"/>
+      <w:r>
+        <w:t>(), nikoli ukládána jako prostý text;</w:t>
+      </w:r>
+    </w:p>
+    <w:p>
+      <w:r>
+        <w:t xml:space="preserve">• ověření hesla probíhá přes </w:t>
+      </w:r>
+      <w:proofErr w:type="spellStart"/>
+      <w:r>
+        <w:t>password_verify</w:t>
+      </w:r>
+      <w:proofErr w:type="spellEnd"/>
+      <w:r>
+        <w:t>();</w:t>
+      </w:r>
+    </w:p>
+    <w:p>
+      <w:r>
+        <w:t>• dashboard je chráněn kontrolou session a nepřihlášený uživatel je přesměrován na login;</w:t>
+      </w:r>
+    </w:p>
+    <w:p>
+      <w:r>
+        <w:t xml:space="preserve">• výpis uživatelského jména, e-mailu a domény používá </w:t>
+      </w:r>
+      <w:proofErr w:type="spellStart"/>
+      <w:r>
+        <w:t>htmlspecialchars</w:t>
+      </w:r>
+      <w:proofErr w:type="spellEnd"/>
+      <w:r>
+        <w:t>(), což omezuje XSS při zobrazení.</w:t>
+      </w:r>
+    </w:p>
     <w:p/>
     <w:p/>
     <w:p/>
@@ -11217,6 +14615,11 @@
           <w:szCs w:val="52"/>
         </w:rPr>
       </w:pPr>
+    </w:p>
+    <w:p>
+      <w:pPr>
+        <w:spacing w:after="80"/>
+      </w:pPr>
       <w:r>
         <w:rPr>
           <w:b/>
@@ -11225,22 +14628,6 @@
           <w:sz w:val="52"/>
           <w:szCs w:val="52"/>
         </w:rPr>
-        <w:br w:type="page"/>
-      </w:r>
-    </w:p>
-    <w:p>
-      <w:pPr>
-        <w:spacing w:after="80"/>
-      </w:pPr>
-      <w:r>
-        <w:rPr>
-          <w:b/>
-          <w:bCs/>
-          <w:color w:val="1F4E79"/>
-          <w:sz w:val="52"/>
-          <w:szCs w:val="52"/>
-        </w:rPr>
-        <w:lastRenderedPageBreak/>
         <w:t>Instalace a provoz</w:t>
       </w:r>
     </w:p>
@@ -11263,11 +14650,11 @@
           <w:bottom w:val="single" w:sz="10" w:space="6" w:color="2E75B6"/>
         </w:pBdr>
       </w:pPr>
-      <w:bookmarkStart w:id="20" w:name="_Toc226914641"/>
+      <w:bookmarkStart w:id="28" w:name="_Toc227005811"/>
       <w:r>
         <w:t>6. Požadavky</w:t>
       </w:r>
-      <w:bookmarkEnd w:id="20"/>
+      <w:bookmarkEnd w:id="28"/>
     </w:p>
     <w:tbl>
       <w:tblPr>
@@ -12021,21 +15408,21 @@
           <w:bottom w:val="single" w:sz="10" w:space="6" w:color="2E75B6"/>
         </w:pBdr>
       </w:pPr>
-      <w:bookmarkStart w:id="21" w:name="_Toc226914642"/>
+      <w:bookmarkStart w:id="29" w:name="_Toc227005812"/>
       <w:r>
         <w:t>7. Instalace a první spuštění</w:t>
       </w:r>
-      <w:bookmarkEnd w:id="21"/>
+      <w:bookmarkEnd w:id="29"/>
     </w:p>
     <w:p>
       <w:pPr>
         <w:pStyle w:val="Nadpis2"/>
       </w:pPr>
-      <w:bookmarkStart w:id="22" w:name="_Toc226914643"/>
+      <w:bookmarkStart w:id="30" w:name="_Toc227005813"/>
       <w:r>
         <w:t>7.1 Příprava prostředí</w:t>
       </w:r>
-      <w:bookmarkEnd w:id="22"/>
+      <w:bookmarkEnd w:id="30"/>
     </w:p>
     <w:p>
       <w:pPr>
@@ -12355,11 +15742,11 @@
       <w:pPr>
         <w:pStyle w:val="Nadpis2"/>
       </w:pPr>
-      <w:bookmarkStart w:id="23" w:name="_Toc226914644"/>
+      <w:bookmarkStart w:id="31" w:name="_Toc227005814"/>
       <w:r>
         <w:t>7.2 Spuštění projektu</w:t>
       </w:r>
-      <w:bookmarkEnd w:id="23"/>
+      <w:bookmarkEnd w:id="31"/>
     </w:p>
     <w:p>
       <w:pPr>
@@ -12453,6 +15840,7 @@
           <w:sz w:val="18"/>
           <w:szCs w:val="18"/>
         </w:rPr>
+        <w:lastRenderedPageBreak/>
         <w:t>docker</w:t>
       </w:r>
       <w:proofErr w:type="spellEnd"/>
@@ -12511,9 +15899,8 @@
       <w:pPr>
         <w:pStyle w:val="Nadpis2"/>
       </w:pPr>
-      <w:bookmarkStart w:id="24" w:name="_Toc226914645"/>
-      <w:r>
-        <w:lastRenderedPageBreak/>
+      <w:bookmarkStart w:id="32" w:name="_Toc227005815"/>
+      <w:r>
         <w:t>7.3 Testovací host záznamy (/</w:t>
       </w:r>
       <w:proofErr w:type="spellStart"/>
@@ -12532,7 +15919,7 @@
       <w:r>
         <w:t>)</w:t>
       </w:r>
-      <w:bookmarkEnd w:id="24"/>
+      <w:bookmarkEnd w:id="32"/>
     </w:p>
     <w:p>
       <w:pPr>
@@ -12700,11 +16087,11 @@
       <w:pPr>
         <w:pStyle w:val="Nadpis2"/>
       </w:pPr>
-      <w:bookmarkStart w:id="25" w:name="_Toc226914646"/>
+      <w:bookmarkStart w:id="33" w:name="_Toc227005816"/>
       <w:r>
         <w:t>7.4 Přístupy po spuštění</w:t>
       </w:r>
-      <w:bookmarkEnd w:id="25"/>
+      <w:bookmarkEnd w:id="33"/>
     </w:p>
     <w:tbl>
       <w:tblPr>
@@ -13384,7 +16771,7 @@
           <w:bottom w:val="single" w:sz="10" w:space="6" w:color="2E75B6"/>
         </w:pBdr>
       </w:pPr>
-      <w:bookmarkStart w:id="26" w:name="_Toc226914647"/>
+      <w:bookmarkStart w:id="34" w:name="_Toc227005817"/>
       <w:r>
         <w:t>8. Konfigurační proměnné (.</w:t>
       </w:r>
@@ -13396,7 +16783,7 @@
       <w:r>
         <w:t>)</w:t>
       </w:r>
-      <w:bookmarkEnd w:id="26"/>
+      <w:bookmarkEnd w:id="34"/>
     </w:p>
     <w:p>
       <w:pPr>
@@ -14441,24 +17828,23 @@
         </w:pBdr>
       </w:pPr>
       <w:r>
-        <w:lastRenderedPageBreak/>
         <w:br/>
       </w:r>
-      <w:bookmarkStart w:id="27" w:name="_Toc226914648"/>
+      <w:bookmarkStart w:id="35" w:name="_Toc227005818"/>
       <w:r>
         <w:t>9. Užitečné příkazy</w:t>
       </w:r>
-      <w:bookmarkEnd w:id="27"/>
+      <w:bookmarkEnd w:id="35"/>
     </w:p>
     <w:p>
       <w:pPr>
         <w:pStyle w:val="Nadpis2"/>
       </w:pPr>
-      <w:bookmarkStart w:id="28" w:name="_Toc226914649"/>
+      <w:bookmarkStart w:id="36" w:name="_Toc227005819"/>
       <w:r>
         <w:t>9.1 Správa kontejnerů</w:t>
       </w:r>
-      <w:bookmarkEnd w:id="28"/>
+      <w:bookmarkEnd w:id="36"/>
     </w:p>
     <w:tbl>
       <w:tblPr>
@@ -15306,11 +18692,11 @@
       <w:pPr>
         <w:pStyle w:val="Nadpis2"/>
       </w:pPr>
-      <w:bookmarkStart w:id="29" w:name="_Toc226914650"/>
+      <w:bookmarkStart w:id="37" w:name="_Toc227005820"/>
       <w:r>
         <w:t>9.2 Správa databáze</w:t>
       </w:r>
-      <w:bookmarkEnd w:id="29"/>
+      <w:bookmarkEnd w:id="37"/>
     </w:p>
     <w:tbl>
       <w:tblPr>
@@ -15982,11 +19368,11 @@
           <w:bottom w:val="single" w:sz="10" w:space="6" w:color="2E75B6"/>
         </w:pBdr>
       </w:pPr>
-      <w:bookmarkStart w:id="30" w:name="_Toc226914651"/>
+      <w:bookmarkStart w:id="38" w:name="_Toc227005821"/>
       <w:r>
         <w:t>10. Licenční ujednání</w:t>
       </w:r>
-      <w:bookmarkEnd w:id="30"/>
+      <w:bookmarkEnd w:id="38"/>
     </w:p>
     <w:p>
       <w:pPr>
@@ -18227,7 +21613,6 @@
   <w:style w:type="character" w:default="1" w:styleId="Standardnpsmoodstavce">
     <w:name w:val="Default Paragraph Font"/>
     <w:uiPriority w:val="1"/>
-    <w:semiHidden/>
     <w:unhideWhenUsed/>
   </w:style>
   <w:style w:type="table" w:default="1" w:styleId="Normlntabulka">
@@ -18445,6 +21830,22 @@
       <w:spacing w:after="100"/>
       <w:ind w:left="440"/>
     </w:pPr>
+  </w:style>
+  <w:style w:type="table" w:styleId="Mkatabulky">
+    <w:name w:val="Table Grid"/>
+    <w:basedOn w:val="Normlntabulka"/>
+    <w:uiPriority w:val="39"/>
+    <w:rsid w:val="004B23C0"/>
+    <w:tblPr>
+      <w:tblBorders>
+        <w:top w:val="single" w:sz="4" w:space="0" w:color="auto"/>
+        <w:left w:val="single" w:sz="4" w:space="0" w:color="auto"/>
+        <w:bottom w:val="single" w:sz="4" w:space="0" w:color="auto"/>
+        <w:right w:val="single" w:sz="4" w:space="0" w:color="auto"/>
+        <w:insideH w:val="single" w:sz="4" w:space="0" w:color="auto"/>
+        <w:insideV w:val="single" w:sz="4" w:space="0" w:color="auto"/>
+      </w:tblBorders>
+    </w:tblPr>
   </w:style>
 </w:styles>
 </file>

</xml_diff>